<commit_message>
étape 12 : écran Réglages — DATES modifiables, Mode test, EFFACER — tests OK
</commit_message>
<xml_diff>
--- a/LISTE DE PRÉSENCE.docx
+++ b/LISTE DE PRÉSENCE.docx
@@ -90,20 +90,22 @@
     <w:tbl>
       <w:tblPr>
         <w:tblStyle w:val="Grilledutableau"/>
-        <w:tblW w:w="5742" w:type="pct"/>
-        <w:tblInd w:w="-714" w:type="dxa"/>
+        <w:tblW w:w="5866" w:type="pct"/>
+        <w:tblInd w:w="-856" w:type="dxa"/>
         <w:tblLayout w:type="fixed"/>
         <w:tblLook w:val="04A0" w:firstRow="1" w:lastRow="0" w:firstColumn="1" w:lastColumn="0" w:noHBand="0" w:noVBand="1"/>
       </w:tblPr>
       <w:tblGrid>
-        <w:gridCol w:w="397"/>
-        <w:gridCol w:w="1871"/>
-        <w:gridCol w:w="1134"/>
-        <w:gridCol w:w="3118"/>
-        <w:gridCol w:w="1218"/>
-        <w:gridCol w:w="935"/>
-        <w:gridCol w:w="935"/>
-        <w:gridCol w:w="799"/>
+        <w:gridCol w:w="1785"/>
+        <w:gridCol w:w="1055"/>
+        <w:gridCol w:w="3256"/>
+        <w:gridCol w:w="1133"/>
+        <w:gridCol w:w="568"/>
+        <w:gridCol w:w="566"/>
+        <w:gridCol w:w="563"/>
+        <w:gridCol w:w="568"/>
+        <w:gridCol w:w="566"/>
+        <w:gridCol w:w="572"/>
       </w:tblGrid>
       <w:tr>
         <w:trPr>
@@ -113,7 +115,7 @@
         <w:tc>
           <w:tcPr>
             <w:tcW w:w="5000" w:type="pct"/>
-            <w:gridSpan w:val="8"/>
+            <w:gridSpan w:val="10"/>
             <w:shd w:val="clear" w:color="auto" w:fill="E2EFD9" w:themeFill="accent6" w:themeFillTint="33"/>
           </w:tcPr>
           <w:p>
@@ -145,7 +147,7 @@
         </w:trPr>
         <w:tc>
           <w:tcPr>
-            <w:tcW w:w="191" w:type="pct"/>
+            <w:tcW w:w="840" w:type="pct"/>
             <w:vAlign w:val="center"/>
           </w:tcPr>
           <w:p>
@@ -167,13 +169,13 @@
                 <w:sz w:val="20"/>
                 <w:szCs w:val="20"/>
               </w:rPr>
-              <w:t>N°</w:t>
+              <w:t>THÈMES</w:t>
             </w:r>
           </w:p>
         </w:tc>
         <w:tc>
           <w:tcPr>
-            <w:tcW w:w="899" w:type="pct"/>
+            <w:tcW w:w="496" w:type="pct"/>
             <w:vAlign w:val="center"/>
           </w:tcPr>
           <w:p>
@@ -195,13 +197,13 @@
                 <w:sz w:val="20"/>
                 <w:szCs w:val="20"/>
               </w:rPr>
-              <w:t>THÈMES</w:t>
+              <w:t>LIEU</w:t>
             </w:r>
           </w:p>
         </w:tc>
         <w:tc>
           <w:tcPr>
-            <w:tcW w:w="545" w:type="pct"/>
+            <w:tcW w:w="1531" w:type="pct"/>
             <w:vAlign w:val="center"/>
           </w:tcPr>
           <w:p>
@@ -223,13 +225,13 @@
                 <w:sz w:val="20"/>
                 <w:szCs w:val="20"/>
               </w:rPr>
-              <w:t>LIEU</w:t>
+              <w:t>PERSONNELS</w:t>
             </w:r>
           </w:p>
         </w:tc>
         <w:tc>
           <w:tcPr>
-            <w:tcW w:w="1498" w:type="pct"/>
+            <w:tcW w:w="533" w:type="pct"/>
             <w:vAlign w:val="center"/>
           </w:tcPr>
           <w:p>
@@ -251,13 +253,14 @@
                 <w:sz w:val="20"/>
                 <w:szCs w:val="20"/>
               </w:rPr>
-              <w:t>PERSONNELS</w:t>
+              <w:t>EFFECTIFS</w:t>
             </w:r>
           </w:p>
         </w:tc>
         <w:tc>
           <w:tcPr>
-            <w:tcW w:w="585" w:type="pct"/>
+            <w:tcW w:w="533" w:type="pct"/>
+            <w:gridSpan w:val="2"/>
             <w:vAlign w:val="center"/>
           </w:tcPr>
           <w:p>
@@ -279,13 +282,14 @@
                 <w:sz w:val="20"/>
                 <w:szCs w:val="20"/>
               </w:rPr>
-              <w:t>EFFECTIFS</w:t>
+              <w:t>Jour 1</w:t>
             </w:r>
           </w:p>
         </w:tc>
         <w:tc>
           <w:tcPr>
-            <w:tcW w:w="449" w:type="pct"/>
+            <w:tcW w:w="532" w:type="pct"/>
+            <w:gridSpan w:val="2"/>
             <w:vAlign w:val="center"/>
           </w:tcPr>
           <w:p>
@@ -307,13 +311,14 @@
                 <w:sz w:val="20"/>
                 <w:szCs w:val="20"/>
               </w:rPr>
-              <w:t>Jour 1</w:t>
+              <w:t>Jour 2</w:t>
             </w:r>
           </w:p>
         </w:tc>
         <w:tc>
           <w:tcPr>
-            <w:tcW w:w="449" w:type="pct"/>
+            <w:tcW w:w="535" w:type="pct"/>
+            <w:gridSpan w:val="2"/>
             <w:vAlign w:val="center"/>
           </w:tcPr>
           <w:p>
@@ -335,13 +340,20 @@
                 <w:sz w:val="20"/>
                 <w:szCs w:val="20"/>
               </w:rPr>
-              <w:t>Jour 2</w:t>
+              <w:t>Jour 3</w:t>
             </w:r>
           </w:p>
         </w:tc>
-        <w:tc>
-          <w:tcPr>
-            <w:tcW w:w="384" w:type="pct"/>
+      </w:tr>
+      <w:tr>
+        <w:trPr>
+          <w:trHeight w:val="265"/>
+          <w:tblHeader/>
+        </w:trPr>
+        <w:tc>
+          <w:tcPr>
+            <w:tcW w:w="840" w:type="pct"/>
+            <w:shd w:val="clear" w:color="auto" w:fill="E2EFD9" w:themeFill="accent6" w:themeFillTint="33"/>
             <w:vAlign w:val="center"/>
           </w:tcPr>
           <w:p>
@@ -355,7 +367,17 @@
                 <w:szCs w:val="20"/>
               </w:rPr>
             </w:pPr>
-            <w:r>
+          </w:p>
+        </w:tc>
+        <w:tc>
+          <w:tcPr>
+            <w:tcW w:w="496" w:type="pct"/>
+            <w:shd w:val="clear" w:color="auto" w:fill="E2EFD9" w:themeFill="accent6" w:themeFillTint="33"/>
+            <w:vAlign w:val="center"/>
+          </w:tcPr>
+          <w:p>
+            <w:pPr>
+              <w:jc w:val="center"/>
               <w:rPr>
                 <w:rFonts w:ascii="Aptos Display" w:eastAsiaTheme="minorHAnsi" w:hAnsi="Aptos Display"/>
                 <w:b/>
@@ -363,7 +385,212 @@
                 <w:sz w:val="20"/>
                 <w:szCs w:val="20"/>
               </w:rPr>
-              <w:t>Jour 3</w:t>
+            </w:pPr>
+          </w:p>
+        </w:tc>
+        <w:tc>
+          <w:tcPr>
+            <w:tcW w:w="1531" w:type="pct"/>
+            <w:shd w:val="clear" w:color="auto" w:fill="E2EFD9" w:themeFill="accent6" w:themeFillTint="33"/>
+            <w:vAlign w:val="center"/>
+          </w:tcPr>
+          <w:p>
+            <w:pPr>
+              <w:jc w:val="center"/>
+              <w:rPr>
+                <w:rFonts w:ascii="Aptos Display" w:eastAsiaTheme="minorHAnsi" w:hAnsi="Aptos Display"/>
+                <w:b/>
+                <w:bCs/>
+                <w:sz w:val="20"/>
+                <w:szCs w:val="20"/>
+              </w:rPr>
+            </w:pPr>
+          </w:p>
+        </w:tc>
+        <w:tc>
+          <w:tcPr>
+            <w:tcW w:w="533" w:type="pct"/>
+            <w:shd w:val="clear" w:color="auto" w:fill="E2EFD9" w:themeFill="accent6" w:themeFillTint="33"/>
+            <w:vAlign w:val="center"/>
+          </w:tcPr>
+          <w:p>
+            <w:pPr>
+              <w:jc w:val="center"/>
+              <w:rPr>
+                <w:rFonts w:ascii="Aptos Display" w:eastAsiaTheme="minorHAnsi" w:hAnsi="Aptos Display"/>
+                <w:b/>
+                <w:bCs/>
+                <w:sz w:val="20"/>
+                <w:szCs w:val="20"/>
+              </w:rPr>
+            </w:pPr>
+          </w:p>
+        </w:tc>
+        <w:tc>
+          <w:tcPr>
+            <w:tcW w:w="267" w:type="pct"/>
+            <w:vAlign w:val="center"/>
+          </w:tcPr>
+          <w:p>
+            <w:pPr>
+              <w:jc w:val="center"/>
+              <w:rPr>
+                <w:rFonts w:ascii="Aptos Display" w:eastAsiaTheme="minorHAnsi" w:hAnsi="Aptos Display"/>
+                <w:b/>
+                <w:bCs/>
+                <w:sz w:val="20"/>
+                <w:szCs w:val="20"/>
+              </w:rPr>
+            </w:pPr>
+            <w:r>
+              <w:rPr>
+                <w:rFonts w:ascii="Aptos Display" w:eastAsiaTheme="minorHAnsi" w:hAnsi="Aptos Display"/>
+                <w:b/>
+                <w:bCs/>
+                <w:sz w:val="20"/>
+                <w:szCs w:val="20"/>
+              </w:rPr>
+              <w:t>Mt</w:t>
+            </w:r>
+          </w:p>
+        </w:tc>
+        <w:tc>
+          <w:tcPr>
+            <w:tcW w:w="266" w:type="pct"/>
+            <w:vAlign w:val="center"/>
+          </w:tcPr>
+          <w:p>
+            <w:pPr>
+              <w:jc w:val="center"/>
+              <w:rPr>
+                <w:rFonts w:ascii="Aptos Display" w:eastAsiaTheme="minorHAnsi" w:hAnsi="Aptos Display"/>
+                <w:b/>
+                <w:bCs/>
+                <w:sz w:val="20"/>
+                <w:szCs w:val="20"/>
+              </w:rPr>
+            </w:pPr>
+            <w:r>
+              <w:rPr>
+                <w:rFonts w:ascii="Aptos Display" w:eastAsiaTheme="minorHAnsi" w:hAnsi="Aptos Display"/>
+                <w:b/>
+                <w:bCs/>
+                <w:sz w:val="20"/>
+                <w:szCs w:val="20"/>
+              </w:rPr>
+              <w:t>Md</w:t>
+            </w:r>
+          </w:p>
+        </w:tc>
+        <w:tc>
+          <w:tcPr>
+            <w:tcW w:w="265" w:type="pct"/>
+            <w:vAlign w:val="center"/>
+          </w:tcPr>
+          <w:p>
+            <w:pPr>
+              <w:jc w:val="center"/>
+              <w:rPr>
+                <w:rFonts w:ascii="Aptos Display" w:eastAsiaTheme="minorHAnsi" w:hAnsi="Aptos Display"/>
+                <w:b/>
+                <w:bCs/>
+                <w:sz w:val="20"/>
+                <w:szCs w:val="20"/>
+              </w:rPr>
+            </w:pPr>
+            <w:r>
+              <w:rPr>
+                <w:rFonts w:ascii="Aptos Display" w:eastAsiaTheme="minorHAnsi" w:hAnsi="Aptos Display"/>
+                <w:b/>
+                <w:bCs/>
+                <w:sz w:val="20"/>
+                <w:szCs w:val="20"/>
+              </w:rPr>
+              <w:t>Mt</w:t>
+            </w:r>
+          </w:p>
+        </w:tc>
+        <w:tc>
+          <w:tcPr>
+            <w:tcW w:w="267" w:type="pct"/>
+            <w:vAlign w:val="center"/>
+          </w:tcPr>
+          <w:p>
+            <w:pPr>
+              <w:jc w:val="center"/>
+              <w:rPr>
+                <w:rFonts w:ascii="Aptos Display" w:eastAsiaTheme="minorHAnsi" w:hAnsi="Aptos Display"/>
+                <w:b/>
+                <w:bCs/>
+                <w:sz w:val="20"/>
+                <w:szCs w:val="20"/>
+              </w:rPr>
+            </w:pPr>
+            <w:r>
+              <w:rPr>
+                <w:rFonts w:ascii="Aptos Display" w:eastAsiaTheme="minorHAnsi" w:hAnsi="Aptos Display"/>
+                <w:b/>
+                <w:bCs/>
+                <w:sz w:val="20"/>
+                <w:szCs w:val="20"/>
+              </w:rPr>
+              <w:t>Md</w:t>
+            </w:r>
+          </w:p>
+        </w:tc>
+        <w:tc>
+          <w:tcPr>
+            <w:tcW w:w="266" w:type="pct"/>
+            <w:vAlign w:val="center"/>
+          </w:tcPr>
+          <w:p>
+            <w:pPr>
+              <w:jc w:val="center"/>
+              <w:rPr>
+                <w:rFonts w:ascii="Aptos Display" w:eastAsiaTheme="minorHAnsi" w:hAnsi="Aptos Display"/>
+                <w:b/>
+                <w:bCs/>
+                <w:sz w:val="20"/>
+                <w:szCs w:val="20"/>
+              </w:rPr>
+            </w:pPr>
+            <w:r>
+              <w:rPr>
+                <w:rFonts w:ascii="Aptos Display" w:eastAsiaTheme="minorHAnsi" w:hAnsi="Aptos Display"/>
+                <w:b/>
+                <w:bCs/>
+                <w:sz w:val="20"/>
+                <w:szCs w:val="20"/>
+              </w:rPr>
+              <w:t>Mt</w:t>
+            </w:r>
+          </w:p>
+        </w:tc>
+        <w:tc>
+          <w:tcPr>
+            <w:tcW w:w="269" w:type="pct"/>
+            <w:vAlign w:val="center"/>
+          </w:tcPr>
+          <w:p>
+            <w:pPr>
+              <w:jc w:val="center"/>
+              <w:rPr>
+                <w:rFonts w:ascii="Aptos Display" w:eastAsiaTheme="minorHAnsi" w:hAnsi="Aptos Display"/>
+                <w:b/>
+                <w:bCs/>
+                <w:sz w:val="20"/>
+                <w:szCs w:val="20"/>
+              </w:rPr>
+            </w:pPr>
+            <w:r>
+              <w:rPr>
+                <w:rFonts w:ascii="Aptos Display" w:eastAsiaTheme="minorHAnsi" w:hAnsi="Aptos Display"/>
+                <w:b/>
+                <w:bCs/>
+                <w:sz w:val="20"/>
+                <w:szCs w:val="20"/>
+              </w:rPr>
+              <w:t>Md</w:t>
             </w:r>
           </w:p>
         </w:tc>
@@ -374,33 +601,7 @@
         </w:trPr>
         <w:tc>
           <w:tcPr>
-            <w:tcW w:w="191" w:type="pct"/>
-            <w:vMerge w:val="restart"/>
-            <w:vAlign w:val="center"/>
-          </w:tcPr>
-          <w:p>
-            <w:pPr>
-              <w:spacing w:before="40" w:after="40"/>
-              <w:jc w:val="center"/>
-              <w:rPr>
-                <w:rFonts w:ascii="Aptos Display" w:eastAsiaTheme="minorHAnsi" w:hAnsi="Aptos Display"/>
-                <w:sz w:val="20"/>
-                <w:szCs w:val="20"/>
-              </w:rPr>
-            </w:pPr>
-            <w:r>
-              <w:rPr>
-                <w:rFonts w:ascii="Aptos Display" w:eastAsiaTheme="minorHAnsi" w:hAnsi="Aptos Display"/>
-                <w:sz w:val="20"/>
-                <w:szCs w:val="20"/>
-              </w:rPr>
-              <w:t>3</w:t>
-            </w:r>
-          </w:p>
-        </w:tc>
-        <w:tc>
-          <w:tcPr>
-            <w:tcW w:w="899" w:type="pct"/>
+            <w:tcW w:w="840" w:type="pct"/>
             <w:vMerge w:val="restart"/>
             <w:vAlign w:val="center"/>
           </w:tcPr>
@@ -430,7 +631,7 @@
         </w:tc>
         <w:tc>
           <w:tcPr>
-            <w:tcW w:w="545" w:type="pct"/>
+            <w:tcW w:w="496" w:type="pct"/>
             <w:vMerge w:val="restart"/>
             <w:vAlign w:val="center"/>
           </w:tcPr>
@@ -456,7 +657,7 @@
         </w:tc>
         <w:tc>
           <w:tcPr>
-            <w:tcW w:w="1498" w:type="pct"/>
+            <w:tcW w:w="1531" w:type="pct"/>
             <w:vAlign w:val="center"/>
           </w:tcPr>
           <w:p>
@@ -490,7 +691,7 @@
         </w:tc>
         <w:tc>
           <w:tcPr>
-            <w:tcW w:w="585" w:type="pct"/>
+            <w:tcW w:w="533" w:type="pct"/>
             <w:vMerge w:val="restart"/>
             <w:vAlign w:val="center"/>
           </w:tcPr>
@@ -516,41 +717,92 @@
         </w:tc>
         <w:tc>
           <w:tcPr>
-            <w:tcW w:w="449" w:type="pct"/>
-            <w:vAlign w:val="center"/>
-          </w:tcPr>
-          <w:p>
-            <w:pPr>
-              <w:spacing w:before="40" w:after="40"/>
-              <w:jc w:val="center"/>
-              <w:rPr>
-                <w:rFonts w:ascii="Aptos Display" w:eastAsiaTheme="minorHAnsi" w:hAnsi="Aptos Display"/>
-                <w:sz w:val="20"/>
-                <w:szCs w:val="20"/>
-              </w:rPr>
-            </w:pPr>
-          </w:p>
-        </w:tc>
-        <w:tc>
-          <w:tcPr>
-            <w:tcW w:w="449" w:type="pct"/>
-            <w:vAlign w:val="center"/>
-          </w:tcPr>
-          <w:p>
-            <w:pPr>
-              <w:spacing w:before="40" w:after="40"/>
-              <w:jc w:val="center"/>
-              <w:rPr>
-                <w:rFonts w:ascii="Aptos Display" w:eastAsiaTheme="minorHAnsi" w:hAnsi="Aptos Display"/>
-                <w:sz w:val="20"/>
-                <w:szCs w:val="20"/>
-              </w:rPr>
-            </w:pPr>
-          </w:p>
-        </w:tc>
-        <w:tc>
-          <w:tcPr>
-            <w:tcW w:w="384" w:type="pct"/>
+            <w:tcW w:w="267" w:type="pct"/>
+            <w:vAlign w:val="center"/>
+          </w:tcPr>
+          <w:p>
+            <w:pPr>
+              <w:spacing w:before="40" w:after="40"/>
+              <w:jc w:val="center"/>
+              <w:rPr>
+                <w:rFonts w:ascii="Aptos Display" w:eastAsiaTheme="minorHAnsi" w:hAnsi="Aptos Display"/>
+                <w:sz w:val="20"/>
+                <w:szCs w:val="20"/>
+              </w:rPr>
+            </w:pPr>
+          </w:p>
+        </w:tc>
+        <w:tc>
+          <w:tcPr>
+            <w:tcW w:w="266" w:type="pct"/>
+            <w:vAlign w:val="center"/>
+          </w:tcPr>
+          <w:p>
+            <w:pPr>
+              <w:spacing w:before="40" w:after="40"/>
+              <w:jc w:val="center"/>
+              <w:rPr>
+                <w:rFonts w:ascii="Aptos Display" w:eastAsiaTheme="minorHAnsi" w:hAnsi="Aptos Display"/>
+                <w:sz w:val="20"/>
+                <w:szCs w:val="20"/>
+              </w:rPr>
+            </w:pPr>
+          </w:p>
+        </w:tc>
+        <w:tc>
+          <w:tcPr>
+            <w:tcW w:w="265" w:type="pct"/>
+            <w:vAlign w:val="center"/>
+          </w:tcPr>
+          <w:p>
+            <w:pPr>
+              <w:spacing w:before="40" w:after="40"/>
+              <w:jc w:val="center"/>
+              <w:rPr>
+                <w:rFonts w:ascii="Aptos Display" w:eastAsiaTheme="minorHAnsi" w:hAnsi="Aptos Display"/>
+                <w:sz w:val="20"/>
+                <w:szCs w:val="20"/>
+              </w:rPr>
+            </w:pPr>
+          </w:p>
+        </w:tc>
+        <w:tc>
+          <w:tcPr>
+            <w:tcW w:w="267" w:type="pct"/>
+            <w:vAlign w:val="center"/>
+          </w:tcPr>
+          <w:p>
+            <w:pPr>
+              <w:spacing w:before="40" w:after="40"/>
+              <w:jc w:val="center"/>
+              <w:rPr>
+                <w:rFonts w:ascii="Aptos Display" w:eastAsiaTheme="minorHAnsi" w:hAnsi="Aptos Display"/>
+                <w:sz w:val="20"/>
+                <w:szCs w:val="20"/>
+              </w:rPr>
+            </w:pPr>
+          </w:p>
+        </w:tc>
+        <w:tc>
+          <w:tcPr>
+            <w:tcW w:w="266" w:type="pct"/>
+            <w:vAlign w:val="center"/>
+          </w:tcPr>
+          <w:p>
+            <w:pPr>
+              <w:spacing w:before="40" w:after="40"/>
+              <w:jc w:val="center"/>
+              <w:rPr>
+                <w:rFonts w:ascii="Aptos Display" w:eastAsiaTheme="minorHAnsi" w:hAnsi="Aptos Display"/>
+                <w:sz w:val="20"/>
+                <w:szCs w:val="20"/>
+              </w:rPr>
+            </w:pPr>
+          </w:p>
+        </w:tc>
+        <w:tc>
+          <w:tcPr>
+            <w:tcW w:w="269" w:type="pct"/>
             <w:vAlign w:val="center"/>
           </w:tcPr>
           <w:p>
@@ -572,7 +824,7 @@
         </w:trPr>
         <w:tc>
           <w:tcPr>
-            <w:tcW w:w="191" w:type="pct"/>
+            <w:tcW w:w="840" w:type="pct"/>
             <w:vMerge/>
             <w:vAlign w:val="center"/>
           </w:tcPr>
@@ -590,7 +842,7 @@
         </w:tc>
         <w:tc>
           <w:tcPr>
-            <w:tcW w:w="899" w:type="pct"/>
+            <w:tcW w:w="496" w:type="pct"/>
             <w:vMerge/>
             <w:vAlign w:val="center"/>
           </w:tcPr>
@@ -608,25 +860,7 @@
         </w:tc>
         <w:tc>
           <w:tcPr>
-            <w:tcW w:w="545" w:type="pct"/>
-            <w:vMerge/>
-            <w:vAlign w:val="center"/>
-          </w:tcPr>
-          <w:p>
-            <w:pPr>
-              <w:spacing w:before="40" w:after="40"/>
-              <w:jc w:val="center"/>
-              <w:rPr>
-                <w:rFonts w:ascii="Aptos Display" w:eastAsiaTheme="minorHAnsi" w:hAnsi="Aptos Display"/>
-                <w:sz w:val="20"/>
-                <w:szCs w:val="20"/>
-              </w:rPr>
-            </w:pPr>
-          </w:p>
-        </w:tc>
-        <w:tc>
-          <w:tcPr>
-            <w:tcW w:w="1498" w:type="pct"/>
+            <w:tcW w:w="1531" w:type="pct"/>
             <w:vAlign w:val="center"/>
           </w:tcPr>
           <w:p>
@@ -660,7 +894,7 @@
         </w:tc>
         <w:tc>
           <w:tcPr>
-            <w:tcW w:w="585" w:type="pct"/>
+            <w:tcW w:w="533" w:type="pct"/>
             <w:vMerge/>
             <w:vAlign w:val="center"/>
           </w:tcPr>
@@ -678,41 +912,75 @@
         </w:tc>
         <w:tc>
           <w:tcPr>
-            <w:tcW w:w="449" w:type="pct"/>
-            <w:vAlign w:val="center"/>
-          </w:tcPr>
-          <w:p>
-            <w:pPr>
-              <w:spacing w:before="40" w:after="40"/>
-              <w:jc w:val="center"/>
-              <w:rPr>
-                <w:rFonts w:ascii="Aptos Display" w:eastAsiaTheme="minorHAnsi" w:hAnsi="Aptos Display"/>
-                <w:sz w:val="20"/>
-                <w:szCs w:val="20"/>
-              </w:rPr>
-            </w:pPr>
-          </w:p>
-        </w:tc>
-        <w:tc>
-          <w:tcPr>
-            <w:tcW w:w="449" w:type="pct"/>
-            <w:vAlign w:val="center"/>
-          </w:tcPr>
-          <w:p>
-            <w:pPr>
-              <w:spacing w:before="40" w:after="40"/>
-              <w:jc w:val="center"/>
-              <w:rPr>
-                <w:rFonts w:ascii="Aptos Display" w:eastAsiaTheme="minorHAnsi" w:hAnsi="Aptos Display"/>
-                <w:sz w:val="20"/>
-                <w:szCs w:val="20"/>
-              </w:rPr>
-            </w:pPr>
-          </w:p>
-        </w:tc>
-        <w:tc>
-          <w:tcPr>
-            <w:tcW w:w="384" w:type="pct"/>
+            <w:tcW w:w="267" w:type="pct"/>
+            <w:vAlign w:val="center"/>
+          </w:tcPr>
+          <w:p>
+            <w:pPr>
+              <w:spacing w:before="40" w:after="40"/>
+              <w:jc w:val="center"/>
+              <w:rPr>
+                <w:rFonts w:ascii="Aptos Display" w:eastAsiaTheme="minorHAnsi" w:hAnsi="Aptos Display"/>
+                <w:sz w:val="20"/>
+                <w:szCs w:val="20"/>
+              </w:rPr>
+            </w:pPr>
+          </w:p>
+        </w:tc>
+        <w:tc>
+          <w:tcPr>
+            <w:tcW w:w="266" w:type="pct"/>
+            <w:vAlign w:val="center"/>
+          </w:tcPr>
+          <w:p>
+            <w:pPr>
+              <w:spacing w:before="40" w:after="40"/>
+              <w:jc w:val="center"/>
+              <w:rPr>
+                <w:rFonts w:ascii="Aptos Display" w:eastAsiaTheme="minorHAnsi" w:hAnsi="Aptos Display"/>
+                <w:sz w:val="20"/>
+                <w:szCs w:val="20"/>
+              </w:rPr>
+            </w:pPr>
+          </w:p>
+        </w:tc>
+        <w:tc>
+          <w:tcPr>
+            <w:tcW w:w="265" w:type="pct"/>
+            <w:vAlign w:val="center"/>
+          </w:tcPr>
+          <w:p>
+            <w:pPr>
+              <w:spacing w:before="40" w:after="40"/>
+              <w:jc w:val="center"/>
+              <w:rPr>
+                <w:rFonts w:ascii="Aptos Display" w:eastAsiaTheme="minorHAnsi" w:hAnsi="Aptos Display"/>
+                <w:sz w:val="20"/>
+                <w:szCs w:val="20"/>
+              </w:rPr>
+            </w:pPr>
+          </w:p>
+        </w:tc>
+        <w:tc>
+          <w:tcPr>
+            <w:tcW w:w="267" w:type="pct"/>
+            <w:vAlign w:val="center"/>
+          </w:tcPr>
+          <w:p>
+            <w:pPr>
+              <w:spacing w:before="40" w:after="40"/>
+              <w:jc w:val="center"/>
+              <w:rPr>
+                <w:rFonts w:ascii="Aptos Display" w:eastAsiaTheme="minorHAnsi" w:hAnsi="Aptos Display"/>
+                <w:sz w:val="20"/>
+                <w:szCs w:val="20"/>
+              </w:rPr>
+            </w:pPr>
+          </w:p>
+        </w:tc>
+        <w:tc>
+          <w:tcPr>
+            <w:tcW w:w="266" w:type="pct"/>
             <w:vAlign w:val="center"/>
           </w:tcPr>
           <w:p>
@@ -735,6 +1003,24 @@
               </w:rPr>
               <w:t xml:space="preserve"> </w:t>
             </w:r>
+          </w:p>
+        </w:tc>
+        <w:tc>
+          <w:tcPr>
+            <w:tcW w:w="269" w:type="pct"/>
+            <w:vAlign w:val="center"/>
+          </w:tcPr>
+          <w:p>
+            <w:pPr>
+              <w:spacing w:before="40" w:after="40"/>
+              <w:jc w:val="center"/>
+              <w:rPr>
+                <w:rFonts w:ascii="Aptos Display" w:eastAsiaTheme="minorHAnsi" w:hAnsi="Aptos Display"/>
+                <w:b/>
+                <w:sz w:val="20"/>
+                <w:szCs w:val="20"/>
+              </w:rPr>
+            </w:pPr>
           </w:p>
         </w:tc>
       </w:tr>
@@ -744,7 +1030,7 @@
         </w:trPr>
         <w:tc>
           <w:tcPr>
-            <w:tcW w:w="191" w:type="pct"/>
+            <w:tcW w:w="840" w:type="pct"/>
             <w:vMerge/>
             <w:vAlign w:val="center"/>
           </w:tcPr>
@@ -762,7 +1048,7 @@
         </w:tc>
         <w:tc>
           <w:tcPr>
-            <w:tcW w:w="899" w:type="pct"/>
+            <w:tcW w:w="496" w:type="pct"/>
             <w:vMerge/>
             <w:vAlign w:val="center"/>
           </w:tcPr>
@@ -780,25 +1066,7 @@
         </w:tc>
         <w:tc>
           <w:tcPr>
-            <w:tcW w:w="545" w:type="pct"/>
-            <w:vMerge/>
-            <w:vAlign w:val="center"/>
-          </w:tcPr>
-          <w:p>
-            <w:pPr>
-              <w:spacing w:before="40" w:after="40"/>
-              <w:jc w:val="center"/>
-              <w:rPr>
-                <w:rFonts w:ascii="Aptos Display" w:eastAsiaTheme="minorHAnsi" w:hAnsi="Aptos Display"/>
-                <w:sz w:val="20"/>
-                <w:szCs w:val="20"/>
-              </w:rPr>
-            </w:pPr>
-          </w:p>
-        </w:tc>
-        <w:tc>
-          <w:tcPr>
-            <w:tcW w:w="1498" w:type="pct"/>
+            <w:tcW w:w="1531" w:type="pct"/>
             <w:vAlign w:val="center"/>
           </w:tcPr>
           <w:p>
@@ -832,7 +1100,7 @@
         </w:tc>
         <w:tc>
           <w:tcPr>
-            <w:tcW w:w="585" w:type="pct"/>
+            <w:tcW w:w="533" w:type="pct"/>
             <w:vMerge/>
             <w:vAlign w:val="center"/>
           </w:tcPr>
@@ -850,41 +1118,93 @@
         </w:tc>
         <w:tc>
           <w:tcPr>
-            <w:tcW w:w="449" w:type="pct"/>
-            <w:vAlign w:val="center"/>
-          </w:tcPr>
-          <w:p>
-            <w:pPr>
-              <w:spacing w:before="40" w:after="40"/>
-              <w:jc w:val="center"/>
-              <w:rPr>
-                <w:rFonts w:ascii="Aptos Display" w:eastAsiaTheme="minorHAnsi" w:hAnsi="Aptos Display"/>
-                <w:sz w:val="20"/>
-                <w:szCs w:val="20"/>
-              </w:rPr>
-            </w:pPr>
-          </w:p>
-        </w:tc>
-        <w:tc>
-          <w:tcPr>
-            <w:tcW w:w="449" w:type="pct"/>
-            <w:vAlign w:val="center"/>
-          </w:tcPr>
-          <w:p>
-            <w:pPr>
-              <w:spacing w:before="40" w:after="40"/>
-              <w:jc w:val="center"/>
-              <w:rPr>
-                <w:rFonts w:ascii="Aptos Display" w:eastAsiaTheme="minorHAnsi" w:hAnsi="Aptos Display"/>
-                <w:sz w:val="20"/>
-                <w:szCs w:val="20"/>
-              </w:rPr>
-            </w:pPr>
-          </w:p>
-        </w:tc>
-        <w:tc>
-          <w:tcPr>
-            <w:tcW w:w="384" w:type="pct"/>
+            <w:tcW w:w="267" w:type="pct"/>
+            <w:vAlign w:val="center"/>
+          </w:tcPr>
+          <w:p>
+            <w:pPr>
+              <w:spacing w:before="40" w:after="40"/>
+              <w:jc w:val="center"/>
+              <w:rPr>
+                <w:rFonts w:ascii="Aptos Display" w:eastAsiaTheme="minorHAnsi" w:hAnsi="Aptos Display"/>
+                <w:sz w:val="20"/>
+                <w:szCs w:val="20"/>
+              </w:rPr>
+            </w:pPr>
+          </w:p>
+        </w:tc>
+        <w:tc>
+          <w:tcPr>
+            <w:tcW w:w="266" w:type="pct"/>
+            <w:vAlign w:val="center"/>
+          </w:tcPr>
+          <w:p>
+            <w:pPr>
+              <w:spacing w:before="40" w:after="40"/>
+              <w:jc w:val="center"/>
+              <w:rPr>
+                <w:rFonts w:ascii="Aptos Display" w:eastAsiaTheme="minorHAnsi" w:hAnsi="Aptos Display"/>
+                <w:sz w:val="20"/>
+                <w:szCs w:val="20"/>
+              </w:rPr>
+            </w:pPr>
+          </w:p>
+        </w:tc>
+        <w:tc>
+          <w:tcPr>
+            <w:tcW w:w="265" w:type="pct"/>
+            <w:vAlign w:val="center"/>
+          </w:tcPr>
+          <w:p>
+            <w:pPr>
+              <w:spacing w:before="40" w:after="40"/>
+              <w:jc w:val="center"/>
+              <w:rPr>
+                <w:rFonts w:ascii="Aptos Display" w:eastAsiaTheme="minorHAnsi" w:hAnsi="Aptos Display"/>
+                <w:sz w:val="20"/>
+                <w:szCs w:val="20"/>
+              </w:rPr>
+            </w:pPr>
+          </w:p>
+        </w:tc>
+        <w:tc>
+          <w:tcPr>
+            <w:tcW w:w="267" w:type="pct"/>
+            <w:vAlign w:val="center"/>
+          </w:tcPr>
+          <w:p>
+            <w:pPr>
+              <w:spacing w:before="40" w:after="40"/>
+              <w:jc w:val="center"/>
+              <w:rPr>
+                <w:rFonts w:ascii="Aptos Display" w:eastAsiaTheme="minorHAnsi" w:hAnsi="Aptos Display"/>
+                <w:sz w:val="20"/>
+                <w:szCs w:val="20"/>
+              </w:rPr>
+            </w:pPr>
+          </w:p>
+        </w:tc>
+        <w:tc>
+          <w:tcPr>
+            <w:tcW w:w="266" w:type="pct"/>
+            <w:vAlign w:val="center"/>
+          </w:tcPr>
+          <w:p>
+            <w:pPr>
+              <w:spacing w:before="40" w:after="40"/>
+              <w:jc w:val="center"/>
+              <w:rPr>
+                <w:rFonts w:ascii="Aptos Display" w:eastAsiaTheme="minorHAnsi" w:hAnsi="Aptos Display"/>
+                <w:b/>
+                <w:sz w:val="20"/>
+                <w:szCs w:val="20"/>
+              </w:rPr>
+            </w:pPr>
+          </w:p>
+        </w:tc>
+        <w:tc>
+          <w:tcPr>
+            <w:tcW w:w="269" w:type="pct"/>
             <w:vAlign w:val="center"/>
           </w:tcPr>
           <w:p>
@@ -907,7 +1227,7 @@
         </w:trPr>
         <w:tc>
           <w:tcPr>
-            <w:tcW w:w="191" w:type="pct"/>
+            <w:tcW w:w="840" w:type="pct"/>
             <w:vMerge/>
             <w:vAlign w:val="center"/>
           </w:tcPr>
@@ -925,7 +1245,7 @@
         </w:tc>
         <w:tc>
           <w:tcPr>
-            <w:tcW w:w="899" w:type="pct"/>
+            <w:tcW w:w="496" w:type="pct"/>
             <w:vMerge/>
             <w:vAlign w:val="center"/>
           </w:tcPr>
@@ -943,25 +1263,7 @@
         </w:tc>
         <w:tc>
           <w:tcPr>
-            <w:tcW w:w="545" w:type="pct"/>
-            <w:vMerge/>
-            <w:vAlign w:val="center"/>
-          </w:tcPr>
-          <w:p>
-            <w:pPr>
-              <w:spacing w:before="40" w:after="40"/>
-              <w:jc w:val="center"/>
-              <w:rPr>
-                <w:rFonts w:ascii="Aptos Display" w:eastAsiaTheme="minorHAnsi" w:hAnsi="Aptos Display"/>
-                <w:sz w:val="20"/>
-                <w:szCs w:val="20"/>
-              </w:rPr>
-            </w:pPr>
-          </w:p>
-        </w:tc>
-        <w:tc>
-          <w:tcPr>
-            <w:tcW w:w="1498" w:type="pct"/>
+            <w:tcW w:w="1531" w:type="pct"/>
             <w:vAlign w:val="center"/>
           </w:tcPr>
           <w:p>
@@ -995,7 +1297,7 @@
         </w:tc>
         <w:tc>
           <w:tcPr>
-            <w:tcW w:w="585" w:type="pct"/>
+            <w:tcW w:w="533" w:type="pct"/>
             <w:vMerge/>
             <w:vAlign w:val="center"/>
           </w:tcPr>
@@ -1013,41 +1315,93 @@
         </w:tc>
         <w:tc>
           <w:tcPr>
-            <w:tcW w:w="449" w:type="pct"/>
-            <w:vAlign w:val="center"/>
-          </w:tcPr>
-          <w:p>
-            <w:pPr>
-              <w:spacing w:before="40" w:after="40"/>
-              <w:jc w:val="center"/>
-              <w:rPr>
-                <w:rFonts w:ascii="Aptos Display" w:eastAsiaTheme="minorHAnsi" w:hAnsi="Aptos Display"/>
-                <w:sz w:val="20"/>
-                <w:szCs w:val="20"/>
-              </w:rPr>
-            </w:pPr>
-          </w:p>
-        </w:tc>
-        <w:tc>
-          <w:tcPr>
-            <w:tcW w:w="449" w:type="pct"/>
-            <w:vAlign w:val="center"/>
-          </w:tcPr>
-          <w:p>
-            <w:pPr>
-              <w:spacing w:before="40" w:after="40"/>
-              <w:jc w:val="center"/>
-              <w:rPr>
-                <w:rFonts w:ascii="Aptos Display" w:eastAsiaTheme="minorHAnsi" w:hAnsi="Aptos Display"/>
-                <w:sz w:val="20"/>
-                <w:szCs w:val="20"/>
-              </w:rPr>
-            </w:pPr>
-          </w:p>
-        </w:tc>
-        <w:tc>
-          <w:tcPr>
-            <w:tcW w:w="384" w:type="pct"/>
+            <w:tcW w:w="267" w:type="pct"/>
+            <w:vAlign w:val="center"/>
+          </w:tcPr>
+          <w:p>
+            <w:pPr>
+              <w:spacing w:before="40" w:after="40"/>
+              <w:jc w:val="center"/>
+              <w:rPr>
+                <w:rFonts w:ascii="Aptos Display" w:eastAsiaTheme="minorHAnsi" w:hAnsi="Aptos Display"/>
+                <w:sz w:val="20"/>
+                <w:szCs w:val="20"/>
+              </w:rPr>
+            </w:pPr>
+          </w:p>
+        </w:tc>
+        <w:tc>
+          <w:tcPr>
+            <w:tcW w:w="266" w:type="pct"/>
+            <w:vAlign w:val="center"/>
+          </w:tcPr>
+          <w:p>
+            <w:pPr>
+              <w:spacing w:before="40" w:after="40"/>
+              <w:jc w:val="center"/>
+              <w:rPr>
+                <w:rFonts w:ascii="Aptos Display" w:eastAsiaTheme="minorHAnsi" w:hAnsi="Aptos Display"/>
+                <w:sz w:val="20"/>
+                <w:szCs w:val="20"/>
+              </w:rPr>
+            </w:pPr>
+          </w:p>
+        </w:tc>
+        <w:tc>
+          <w:tcPr>
+            <w:tcW w:w="265" w:type="pct"/>
+            <w:vAlign w:val="center"/>
+          </w:tcPr>
+          <w:p>
+            <w:pPr>
+              <w:spacing w:before="40" w:after="40"/>
+              <w:jc w:val="center"/>
+              <w:rPr>
+                <w:rFonts w:ascii="Aptos Display" w:eastAsiaTheme="minorHAnsi" w:hAnsi="Aptos Display"/>
+                <w:sz w:val="20"/>
+                <w:szCs w:val="20"/>
+              </w:rPr>
+            </w:pPr>
+          </w:p>
+        </w:tc>
+        <w:tc>
+          <w:tcPr>
+            <w:tcW w:w="267" w:type="pct"/>
+            <w:vAlign w:val="center"/>
+          </w:tcPr>
+          <w:p>
+            <w:pPr>
+              <w:spacing w:before="40" w:after="40"/>
+              <w:jc w:val="center"/>
+              <w:rPr>
+                <w:rFonts w:ascii="Aptos Display" w:eastAsiaTheme="minorHAnsi" w:hAnsi="Aptos Display"/>
+                <w:sz w:val="20"/>
+                <w:szCs w:val="20"/>
+              </w:rPr>
+            </w:pPr>
+          </w:p>
+        </w:tc>
+        <w:tc>
+          <w:tcPr>
+            <w:tcW w:w="266" w:type="pct"/>
+            <w:vAlign w:val="center"/>
+          </w:tcPr>
+          <w:p>
+            <w:pPr>
+              <w:spacing w:before="40" w:after="40"/>
+              <w:jc w:val="center"/>
+              <w:rPr>
+                <w:rFonts w:ascii="Aptos Display" w:eastAsiaTheme="minorHAnsi" w:hAnsi="Aptos Display"/>
+                <w:b/>
+                <w:sz w:val="20"/>
+                <w:szCs w:val="20"/>
+              </w:rPr>
+            </w:pPr>
+          </w:p>
+        </w:tc>
+        <w:tc>
+          <w:tcPr>
+            <w:tcW w:w="269" w:type="pct"/>
             <w:vAlign w:val="center"/>
           </w:tcPr>
           <w:p>
@@ -1070,7 +1424,7 @@
         </w:trPr>
         <w:tc>
           <w:tcPr>
-            <w:tcW w:w="191" w:type="pct"/>
+            <w:tcW w:w="840" w:type="pct"/>
             <w:vMerge/>
             <w:vAlign w:val="center"/>
           </w:tcPr>
@@ -1088,7 +1442,7 @@
         </w:tc>
         <w:tc>
           <w:tcPr>
-            <w:tcW w:w="899" w:type="pct"/>
+            <w:tcW w:w="496" w:type="pct"/>
             <w:vMerge/>
             <w:vAlign w:val="center"/>
           </w:tcPr>
@@ -1106,25 +1460,7 @@
         </w:tc>
         <w:tc>
           <w:tcPr>
-            <w:tcW w:w="545" w:type="pct"/>
-            <w:vMerge/>
-            <w:vAlign w:val="center"/>
-          </w:tcPr>
-          <w:p>
-            <w:pPr>
-              <w:spacing w:before="40" w:after="40"/>
-              <w:jc w:val="center"/>
-              <w:rPr>
-                <w:rFonts w:ascii="Aptos Display" w:eastAsiaTheme="minorHAnsi" w:hAnsi="Aptos Display"/>
-                <w:sz w:val="20"/>
-                <w:szCs w:val="20"/>
-              </w:rPr>
-            </w:pPr>
-          </w:p>
-        </w:tc>
-        <w:tc>
-          <w:tcPr>
-            <w:tcW w:w="1498" w:type="pct"/>
+            <w:tcW w:w="1531" w:type="pct"/>
             <w:vAlign w:val="center"/>
           </w:tcPr>
           <w:p>
@@ -1158,7 +1494,7 @@
         </w:tc>
         <w:tc>
           <w:tcPr>
-            <w:tcW w:w="585" w:type="pct"/>
+            <w:tcW w:w="533" w:type="pct"/>
             <w:vMerge/>
             <w:vAlign w:val="center"/>
           </w:tcPr>
@@ -1176,41 +1512,93 @@
         </w:tc>
         <w:tc>
           <w:tcPr>
-            <w:tcW w:w="449" w:type="pct"/>
-            <w:vAlign w:val="center"/>
-          </w:tcPr>
-          <w:p>
-            <w:pPr>
-              <w:spacing w:before="40" w:after="40"/>
-              <w:jc w:val="center"/>
-              <w:rPr>
-                <w:rFonts w:ascii="Aptos Display" w:eastAsiaTheme="minorHAnsi" w:hAnsi="Aptos Display"/>
-                <w:sz w:val="20"/>
-                <w:szCs w:val="20"/>
-              </w:rPr>
-            </w:pPr>
-          </w:p>
-        </w:tc>
-        <w:tc>
-          <w:tcPr>
-            <w:tcW w:w="449" w:type="pct"/>
-            <w:vAlign w:val="center"/>
-          </w:tcPr>
-          <w:p>
-            <w:pPr>
-              <w:spacing w:before="40" w:after="40"/>
-              <w:jc w:val="center"/>
-              <w:rPr>
-                <w:rFonts w:ascii="Aptos Display" w:eastAsiaTheme="minorHAnsi" w:hAnsi="Aptos Display"/>
-                <w:sz w:val="20"/>
-                <w:szCs w:val="20"/>
-              </w:rPr>
-            </w:pPr>
-          </w:p>
-        </w:tc>
-        <w:tc>
-          <w:tcPr>
-            <w:tcW w:w="384" w:type="pct"/>
+            <w:tcW w:w="267" w:type="pct"/>
+            <w:vAlign w:val="center"/>
+          </w:tcPr>
+          <w:p>
+            <w:pPr>
+              <w:spacing w:before="40" w:after="40"/>
+              <w:jc w:val="center"/>
+              <w:rPr>
+                <w:rFonts w:ascii="Aptos Display" w:eastAsiaTheme="minorHAnsi" w:hAnsi="Aptos Display"/>
+                <w:sz w:val="20"/>
+                <w:szCs w:val="20"/>
+              </w:rPr>
+            </w:pPr>
+          </w:p>
+        </w:tc>
+        <w:tc>
+          <w:tcPr>
+            <w:tcW w:w="266" w:type="pct"/>
+            <w:vAlign w:val="center"/>
+          </w:tcPr>
+          <w:p>
+            <w:pPr>
+              <w:spacing w:before="40" w:after="40"/>
+              <w:jc w:val="center"/>
+              <w:rPr>
+                <w:rFonts w:ascii="Aptos Display" w:eastAsiaTheme="minorHAnsi" w:hAnsi="Aptos Display"/>
+                <w:sz w:val="20"/>
+                <w:szCs w:val="20"/>
+              </w:rPr>
+            </w:pPr>
+          </w:p>
+        </w:tc>
+        <w:tc>
+          <w:tcPr>
+            <w:tcW w:w="265" w:type="pct"/>
+            <w:vAlign w:val="center"/>
+          </w:tcPr>
+          <w:p>
+            <w:pPr>
+              <w:spacing w:before="40" w:after="40"/>
+              <w:jc w:val="center"/>
+              <w:rPr>
+                <w:rFonts w:ascii="Aptos Display" w:eastAsiaTheme="minorHAnsi" w:hAnsi="Aptos Display"/>
+                <w:sz w:val="20"/>
+                <w:szCs w:val="20"/>
+              </w:rPr>
+            </w:pPr>
+          </w:p>
+        </w:tc>
+        <w:tc>
+          <w:tcPr>
+            <w:tcW w:w="267" w:type="pct"/>
+            <w:vAlign w:val="center"/>
+          </w:tcPr>
+          <w:p>
+            <w:pPr>
+              <w:spacing w:before="40" w:after="40"/>
+              <w:jc w:val="center"/>
+              <w:rPr>
+                <w:rFonts w:ascii="Aptos Display" w:eastAsiaTheme="minorHAnsi" w:hAnsi="Aptos Display"/>
+                <w:sz w:val="20"/>
+                <w:szCs w:val="20"/>
+              </w:rPr>
+            </w:pPr>
+          </w:p>
+        </w:tc>
+        <w:tc>
+          <w:tcPr>
+            <w:tcW w:w="266" w:type="pct"/>
+            <w:vAlign w:val="center"/>
+          </w:tcPr>
+          <w:p>
+            <w:pPr>
+              <w:spacing w:before="40" w:after="40"/>
+              <w:jc w:val="center"/>
+              <w:rPr>
+                <w:rFonts w:ascii="Aptos Display" w:eastAsiaTheme="minorHAnsi" w:hAnsi="Aptos Display"/>
+                <w:b/>
+                <w:sz w:val="20"/>
+                <w:szCs w:val="20"/>
+              </w:rPr>
+            </w:pPr>
+          </w:p>
+        </w:tc>
+        <w:tc>
+          <w:tcPr>
+            <w:tcW w:w="269" w:type="pct"/>
             <w:vAlign w:val="center"/>
           </w:tcPr>
           <w:p>
@@ -1233,7 +1621,7 @@
         </w:trPr>
         <w:tc>
           <w:tcPr>
-            <w:tcW w:w="191" w:type="pct"/>
+            <w:tcW w:w="840" w:type="pct"/>
             <w:vMerge/>
             <w:vAlign w:val="center"/>
           </w:tcPr>
@@ -1251,7 +1639,7 @@
         </w:tc>
         <w:tc>
           <w:tcPr>
-            <w:tcW w:w="899" w:type="pct"/>
+            <w:tcW w:w="496" w:type="pct"/>
             <w:vMerge/>
             <w:vAlign w:val="center"/>
           </w:tcPr>
@@ -1269,25 +1657,7 @@
         </w:tc>
         <w:tc>
           <w:tcPr>
-            <w:tcW w:w="545" w:type="pct"/>
-            <w:vMerge/>
-            <w:vAlign w:val="center"/>
-          </w:tcPr>
-          <w:p>
-            <w:pPr>
-              <w:spacing w:before="40" w:after="40"/>
-              <w:jc w:val="center"/>
-              <w:rPr>
-                <w:rFonts w:ascii="Aptos Display" w:eastAsiaTheme="minorHAnsi" w:hAnsi="Aptos Display"/>
-                <w:sz w:val="20"/>
-                <w:szCs w:val="20"/>
-              </w:rPr>
-            </w:pPr>
-          </w:p>
-        </w:tc>
-        <w:tc>
-          <w:tcPr>
-            <w:tcW w:w="1498" w:type="pct"/>
+            <w:tcW w:w="1531" w:type="pct"/>
             <w:vAlign w:val="center"/>
           </w:tcPr>
           <w:p>
@@ -1318,7 +1688,7 @@
         </w:tc>
         <w:tc>
           <w:tcPr>
-            <w:tcW w:w="585" w:type="pct"/>
+            <w:tcW w:w="533" w:type="pct"/>
             <w:vMerge/>
             <w:vAlign w:val="center"/>
           </w:tcPr>
@@ -1336,41 +1706,92 @@
         </w:tc>
         <w:tc>
           <w:tcPr>
-            <w:tcW w:w="449" w:type="pct"/>
-            <w:vAlign w:val="center"/>
-          </w:tcPr>
-          <w:p>
-            <w:pPr>
-              <w:spacing w:before="40" w:after="40"/>
-              <w:jc w:val="center"/>
-              <w:rPr>
-                <w:rFonts w:ascii="Aptos Display" w:eastAsiaTheme="minorHAnsi" w:hAnsi="Aptos Display"/>
-                <w:sz w:val="20"/>
-                <w:szCs w:val="20"/>
-              </w:rPr>
-            </w:pPr>
-          </w:p>
-        </w:tc>
-        <w:tc>
-          <w:tcPr>
-            <w:tcW w:w="449" w:type="pct"/>
-            <w:vAlign w:val="center"/>
-          </w:tcPr>
-          <w:p>
-            <w:pPr>
-              <w:spacing w:before="40" w:after="40"/>
-              <w:jc w:val="center"/>
-              <w:rPr>
-                <w:rFonts w:ascii="Aptos Display" w:eastAsiaTheme="minorHAnsi" w:hAnsi="Aptos Display"/>
-                <w:sz w:val="20"/>
-                <w:szCs w:val="20"/>
-              </w:rPr>
-            </w:pPr>
-          </w:p>
-        </w:tc>
-        <w:tc>
-          <w:tcPr>
-            <w:tcW w:w="384" w:type="pct"/>
+            <w:tcW w:w="267" w:type="pct"/>
+            <w:vAlign w:val="center"/>
+          </w:tcPr>
+          <w:p>
+            <w:pPr>
+              <w:spacing w:before="40" w:after="40"/>
+              <w:jc w:val="center"/>
+              <w:rPr>
+                <w:rFonts w:ascii="Aptos Display" w:eastAsiaTheme="minorHAnsi" w:hAnsi="Aptos Display"/>
+                <w:sz w:val="20"/>
+                <w:szCs w:val="20"/>
+              </w:rPr>
+            </w:pPr>
+          </w:p>
+        </w:tc>
+        <w:tc>
+          <w:tcPr>
+            <w:tcW w:w="266" w:type="pct"/>
+            <w:vAlign w:val="center"/>
+          </w:tcPr>
+          <w:p>
+            <w:pPr>
+              <w:spacing w:before="40" w:after="40"/>
+              <w:jc w:val="center"/>
+              <w:rPr>
+                <w:rFonts w:ascii="Aptos Display" w:eastAsiaTheme="minorHAnsi" w:hAnsi="Aptos Display"/>
+                <w:sz w:val="20"/>
+                <w:szCs w:val="20"/>
+              </w:rPr>
+            </w:pPr>
+          </w:p>
+        </w:tc>
+        <w:tc>
+          <w:tcPr>
+            <w:tcW w:w="265" w:type="pct"/>
+            <w:vAlign w:val="center"/>
+          </w:tcPr>
+          <w:p>
+            <w:pPr>
+              <w:spacing w:before="40" w:after="40"/>
+              <w:jc w:val="center"/>
+              <w:rPr>
+                <w:rFonts w:ascii="Aptos Display" w:eastAsiaTheme="minorHAnsi" w:hAnsi="Aptos Display"/>
+                <w:sz w:val="20"/>
+                <w:szCs w:val="20"/>
+              </w:rPr>
+            </w:pPr>
+          </w:p>
+        </w:tc>
+        <w:tc>
+          <w:tcPr>
+            <w:tcW w:w="267" w:type="pct"/>
+            <w:vAlign w:val="center"/>
+          </w:tcPr>
+          <w:p>
+            <w:pPr>
+              <w:spacing w:before="40" w:after="40"/>
+              <w:jc w:val="center"/>
+              <w:rPr>
+                <w:rFonts w:ascii="Aptos Display" w:eastAsiaTheme="minorHAnsi" w:hAnsi="Aptos Display"/>
+                <w:sz w:val="20"/>
+                <w:szCs w:val="20"/>
+              </w:rPr>
+            </w:pPr>
+          </w:p>
+        </w:tc>
+        <w:tc>
+          <w:tcPr>
+            <w:tcW w:w="266" w:type="pct"/>
+            <w:vAlign w:val="center"/>
+          </w:tcPr>
+          <w:p>
+            <w:pPr>
+              <w:spacing w:before="40" w:after="40"/>
+              <w:jc w:val="center"/>
+              <w:rPr>
+                <w:rFonts w:ascii="Aptos Display" w:eastAsiaTheme="minorHAnsi" w:hAnsi="Aptos Display"/>
+                <w:sz w:val="20"/>
+                <w:szCs w:val="20"/>
+              </w:rPr>
+            </w:pPr>
+          </w:p>
+        </w:tc>
+        <w:tc>
+          <w:tcPr>
+            <w:tcW w:w="269" w:type="pct"/>
             <w:vAlign w:val="center"/>
           </w:tcPr>
           <w:p>
@@ -1392,7 +1813,7 @@
         </w:trPr>
         <w:tc>
           <w:tcPr>
-            <w:tcW w:w="191" w:type="pct"/>
+            <w:tcW w:w="840" w:type="pct"/>
             <w:vMerge/>
             <w:vAlign w:val="center"/>
           </w:tcPr>
@@ -1410,7 +1831,7 @@
         </w:tc>
         <w:tc>
           <w:tcPr>
-            <w:tcW w:w="899" w:type="pct"/>
+            <w:tcW w:w="496" w:type="pct"/>
             <w:vMerge/>
             <w:vAlign w:val="center"/>
           </w:tcPr>
@@ -1428,25 +1849,7 @@
         </w:tc>
         <w:tc>
           <w:tcPr>
-            <w:tcW w:w="545" w:type="pct"/>
-            <w:vMerge/>
-            <w:vAlign w:val="center"/>
-          </w:tcPr>
-          <w:p>
-            <w:pPr>
-              <w:spacing w:before="40" w:after="40"/>
-              <w:jc w:val="center"/>
-              <w:rPr>
-                <w:rFonts w:ascii="Aptos Display" w:eastAsiaTheme="minorHAnsi" w:hAnsi="Aptos Display"/>
-                <w:sz w:val="20"/>
-                <w:szCs w:val="20"/>
-              </w:rPr>
-            </w:pPr>
-          </w:p>
-        </w:tc>
-        <w:tc>
-          <w:tcPr>
-            <w:tcW w:w="1498" w:type="pct"/>
+            <w:tcW w:w="1531" w:type="pct"/>
             <w:vAlign w:val="center"/>
           </w:tcPr>
           <w:p>
@@ -1477,7 +1880,7 @@
         </w:tc>
         <w:tc>
           <w:tcPr>
-            <w:tcW w:w="585" w:type="pct"/>
+            <w:tcW w:w="533" w:type="pct"/>
             <w:vMerge/>
             <w:vAlign w:val="center"/>
           </w:tcPr>
@@ -1495,41 +1898,92 @@
         </w:tc>
         <w:tc>
           <w:tcPr>
-            <w:tcW w:w="449" w:type="pct"/>
-            <w:vAlign w:val="center"/>
-          </w:tcPr>
-          <w:p>
-            <w:pPr>
-              <w:spacing w:before="40" w:after="40"/>
-              <w:jc w:val="center"/>
-              <w:rPr>
-                <w:rFonts w:ascii="Aptos Display" w:eastAsiaTheme="minorHAnsi" w:hAnsi="Aptos Display"/>
-                <w:sz w:val="20"/>
-                <w:szCs w:val="20"/>
-              </w:rPr>
-            </w:pPr>
-          </w:p>
-        </w:tc>
-        <w:tc>
-          <w:tcPr>
-            <w:tcW w:w="449" w:type="pct"/>
-            <w:vAlign w:val="center"/>
-          </w:tcPr>
-          <w:p>
-            <w:pPr>
-              <w:spacing w:before="40" w:after="40"/>
-              <w:jc w:val="center"/>
-              <w:rPr>
-                <w:rFonts w:ascii="Aptos Display" w:eastAsiaTheme="minorHAnsi" w:hAnsi="Aptos Display"/>
-                <w:sz w:val="20"/>
-                <w:szCs w:val="20"/>
-              </w:rPr>
-            </w:pPr>
-          </w:p>
-        </w:tc>
-        <w:tc>
-          <w:tcPr>
-            <w:tcW w:w="384" w:type="pct"/>
+            <w:tcW w:w="267" w:type="pct"/>
+            <w:vAlign w:val="center"/>
+          </w:tcPr>
+          <w:p>
+            <w:pPr>
+              <w:spacing w:before="40" w:after="40"/>
+              <w:jc w:val="center"/>
+              <w:rPr>
+                <w:rFonts w:ascii="Aptos Display" w:eastAsiaTheme="minorHAnsi" w:hAnsi="Aptos Display"/>
+                <w:sz w:val="20"/>
+                <w:szCs w:val="20"/>
+              </w:rPr>
+            </w:pPr>
+          </w:p>
+        </w:tc>
+        <w:tc>
+          <w:tcPr>
+            <w:tcW w:w="266" w:type="pct"/>
+            <w:vAlign w:val="center"/>
+          </w:tcPr>
+          <w:p>
+            <w:pPr>
+              <w:spacing w:before="40" w:after="40"/>
+              <w:jc w:val="center"/>
+              <w:rPr>
+                <w:rFonts w:ascii="Aptos Display" w:eastAsiaTheme="minorHAnsi" w:hAnsi="Aptos Display"/>
+                <w:sz w:val="20"/>
+                <w:szCs w:val="20"/>
+              </w:rPr>
+            </w:pPr>
+          </w:p>
+        </w:tc>
+        <w:tc>
+          <w:tcPr>
+            <w:tcW w:w="265" w:type="pct"/>
+            <w:vAlign w:val="center"/>
+          </w:tcPr>
+          <w:p>
+            <w:pPr>
+              <w:spacing w:before="40" w:after="40"/>
+              <w:jc w:val="center"/>
+              <w:rPr>
+                <w:rFonts w:ascii="Aptos Display" w:eastAsiaTheme="minorHAnsi" w:hAnsi="Aptos Display"/>
+                <w:sz w:val="20"/>
+                <w:szCs w:val="20"/>
+              </w:rPr>
+            </w:pPr>
+          </w:p>
+        </w:tc>
+        <w:tc>
+          <w:tcPr>
+            <w:tcW w:w="267" w:type="pct"/>
+            <w:vAlign w:val="center"/>
+          </w:tcPr>
+          <w:p>
+            <w:pPr>
+              <w:spacing w:before="40" w:after="40"/>
+              <w:jc w:val="center"/>
+              <w:rPr>
+                <w:rFonts w:ascii="Aptos Display" w:eastAsiaTheme="minorHAnsi" w:hAnsi="Aptos Display"/>
+                <w:sz w:val="20"/>
+                <w:szCs w:val="20"/>
+              </w:rPr>
+            </w:pPr>
+          </w:p>
+        </w:tc>
+        <w:tc>
+          <w:tcPr>
+            <w:tcW w:w="266" w:type="pct"/>
+            <w:vAlign w:val="center"/>
+          </w:tcPr>
+          <w:p>
+            <w:pPr>
+              <w:spacing w:before="40" w:after="40"/>
+              <w:jc w:val="center"/>
+              <w:rPr>
+                <w:rFonts w:ascii="Aptos Display" w:eastAsiaTheme="minorHAnsi" w:hAnsi="Aptos Display"/>
+                <w:sz w:val="20"/>
+                <w:szCs w:val="20"/>
+              </w:rPr>
+            </w:pPr>
+          </w:p>
+        </w:tc>
+        <w:tc>
+          <w:tcPr>
+            <w:tcW w:w="269" w:type="pct"/>
             <w:vAlign w:val="center"/>
           </w:tcPr>
           <w:p>
@@ -1551,7 +2005,7 @@
         </w:trPr>
         <w:tc>
           <w:tcPr>
-            <w:tcW w:w="191" w:type="pct"/>
+            <w:tcW w:w="840" w:type="pct"/>
             <w:vMerge/>
             <w:vAlign w:val="center"/>
           </w:tcPr>
@@ -1569,7 +2023,7 @@
         </w:tc>
         <w:tc>
           <w:tcPr>
-            <w:tcW w:w="899" w:type="pct"/>
+            <w:tcW w:w="496" w:type="pct"/>
             <w:vMerge/>
             <w:vAlign w:val="center"/>
           </w:tcPr>
@@ -1587,25 +2041,7 @@
         </w:tc>
         <w:tc>
           <w:tcPr>
-            <w:tcW w:w="545" w:type="pct"/>
-            <w:vMerge/>
-            <w:vAlign w:val="center"/>
-          </w:tcPr>
-          <w:p>
-            <w:pPr>
-              <w:spacing w:before="40" w:after="40"/>
-              <w:jc w:val="center"/>
-              <w:rPr>
-                <w:rFonts w:ascii="Aptos Display" w:eastAsiaTheme="minorHAnsi" w:hAnsi="Aptos Display"/>
-                <w:sz w:val="20"/>
-                <w:szCs w:val="20"/>
-              </w:rPr>
-            </w:pPr>
-          </w:p>
-        </w:tc>
-        <w:tc>
-          <w:tcPr>
-            <w:tcW w:w="1498" w:type="pct"/>
+            <w:tcW w:w="1531" w:type="pct"/>
             <w:vAlign w:val="center"/>
           </w:tcPr>
           <w:p>
@@ -1639,7 +2075,7 @@
         </w:tc>
         <w:tc>
           <w:tcPr>
-            <w:tcW w:w="585" w:type="pct"/>
+            <w:tcW w:w="533" w:type="pct"/>
             <w:vMerge/>
             <w:vAlign w:val="center"/>
           </w:tcPr>
@@ -1657,41 +2093,75 @@
         </w:tc>
         <w:tc>
           <w:tcPr>
-            <w:tcW w:w="449" w:type="pct"/>
-            <w:vAlign w:val="center"/>
-          </w:tcPr>
-          <w:p>
-            <w:pPr>
-              <w:spacing w:before="40" w:after="40"/>
-              <w:jc w:val="center"/>
-              <w:rPr>
-                <w:rFonts w:ascii="Aptos Display" w:eastAsiaTheme="minorHAnsi" w:hAnsi="Aptos Display"/>
-                <w:sz w:val="20"/>
-                <w:szCs w:val="20"/>
-              </w:rPr>
-            </w:pPr>
-          </w:p>
-        </w:tc>
-        <w:tc>
-          <w:tcPr>
-            <w:tcW w:w="449" w:type="pct"/>
-            <w:vAlign w:val="center"/>
-          </w:tcPr>
-          <w:p>
-            <w:pPr>
-              <w:spacing w:before="40" w:after="40"/>
-              <w:jc w:val="center"/>
-              <w:rPr>
-                <w:rFonts w:ascii="Aptos Display" w:eastAsiaTheme="minorHAnsi" w:hAnsi="Aptos Display"/>
-                <w:sz w:val="20"/>
-                <w:szCs w:val="20"/>
-              </w:rPr>
-            </w:pPr>
-          </w:p>
-        </w:tc>
-        <w:tc>
-          <w:tcPr>
-            <w:tcW w:w="384" w:type="pct"/>
+            <w:tcW w:w="267" w:type="pct"/>
+            <w:vAlign w:val="center"/>
+          </w:tcPr>
+          <w:p>
+            <w:pPr>
+              <w:spacing w:before="40" w:after="40"/>
+              <w:jc w:val="center"/>
+              <w:rPr>
+                <w:rFonts w:ascii="Aptos Display" w:eastAsiaTheme="minorHAnsi" w:hAnsi="Aptos Display"/>
+                <w:sz w:val="20"/>
+                <w:szCs w:val="20"/>
+              </w:rPr>
+            </w:pPr>
+          </w:p>
+        </w:tc>
+        <w:tc>
+          <w:tcPr>
+            <w:tcW w:w="266" w:type="pct"/>
+            <w:vAlign w:val="center"/>
+          </w:tcPr>
+          <w:p>
+            <w:pPr>
+              <w:spacing w:before="40" w:after="40"/>
+              <w:jc w:val="center"/>
+              <w:rPr>
+                <w:rFonts w:ascii="Aptos Display" w:eastAsiaTheme="minorHAnsi" w:hAnsi="Aptos Display"/>
+                <w:sz w:val="20"/>
+                <w:szCs w:val="20"/>
+              </w:rPr>
+            </w:pPr>
+          </w:p>
+        </w:tc>
+        <w:tc>
+          <w:tcPr>
+            <w:tcW w:w="265" w:type="pct"/>
+            <w:vAlign w:val="center"/>
+          </w:tcPr>
+          <w:p>
+            <w:pPr>
+              <w:spacing w:before="40" w:after="40"/>
+              <w:jc w:val="center"/>
+              <w:rPr>
+                <w:rFonts w:ascii="Aptos Display" w:eastAsiaTheme="minorHAnsi" w:hAnsi="Aptos Display"/>
+                <w:sz w:val="20"/>
+                <w:szCs w:val="20"/>
+              </w:rPr>
+            </w:pPr>
+          </w:p>
+        </w:tc>
+        <w:tc>
+          <w:tcPr>
+            <w:tcW w:w="267" w:type="pct"/>
+            <w:vAlign w:val="center"/>
+          </w:tcPr>
+          <w:p>
+            <w:pPr>
+              <w:spacing w:before="40" w:after="40"/>
+              <w:jc w:val="center"/>
+              <w:rPr>
+                <w:rFonts w:ascii="Aptos Display" w:eastAsiaTheme="minorHAnsi" w:hAnsi="Aptos Display"/>
+                <w:sz w:val="20"/>
+                <w:szCs w:val="20"/>
+              </w:rPr>
+            </w:pPr>
+          </w:p>
+        </w:tc>
+        <w:tc>
+          <w:tcPr>
+            <w:tcW w:w="266" w:type="pct"/>
             <w:vAlign w:val="center"/>
           </w:tcPr>
           <w:p>
@@ -1712,6 +2182,23 @@
               </w:rPr>
               <w:t xml:space="preserve"> </w:t>
             </w:r>
+          </w:p>
+        </w:tc>
+        <w:tc>
+          <w:tcPr>
+            <w:tcW w:w="269" w:type="pct"/>
+            <w:vAlign w:val="center"/>
+          </w:tcPr>
+          <w:p>
+            <w:pPr>
+              <w:spacing w:before="40" w:after="40"/>
+              <w:jc w:val="center"/>
+              <w:rPr>
+                <w:rFonts w:ascii="Aptos Display" w:eastAsiaTheme="minorHAnsi" w:hAnsi="Aptos Display"/>
+                <w:sz w:val="20"/>
+                <w:szCs w:val="20"/>
+              </w:rPr>
+            </w:pPr>
           </w:p>
         </w:tc>
       </w:tr>
@@ -1721,7 +2208,7 @@
         </w:trPr>
         <w:tc>
           <w:tcPr>
-            <w:tcW w:w="191" w:type="pct"/>
+            <w:tcW w:w="840" w:type="pct"/>
             <w:vMerge/>
             <w:vAlign w:val="center"/>
           </w:tcPr>
@@ -1739,7 +2226,7 @@
         </w:tc>
         <w:tc>
           <w:tcPr>
-            <w:tcW w:w="899" w:type="pct"/>
+            <w:tcW w:w="496" w:type="pct"/>
             <w:vMerge/>
             <w:vAlign w:val="center"/>
           </w:tcPr>
@@ -1757,25 +2244,7 @@
         </w:tc>
         <w:tc>
           <w:tcPr>
-            <w:tcW w:w="545" w:type="pct"/>
-            <w:vMerge/>
-            <w:vAlign w:val="center"/>
-          </w:tcPr>
-          <w:p>
-            <w:pPr>
-              <w:spacing w:before="40" w:after="40"/>
-              <w:jc w:val="center"/>
-              <w:rPr>
-                <w:rFonts w:ascii="Aptos Display" w:eastAsiaTheme="minorHAnsi" w:hAnsi="Aptos Display"/>
-                <w:sz w:val="20"/>
-                <w:szCs w:val="20"/>
-              </w:rPr>
-            </w:pPr>
-          </w:p>
-        </w:tc>
-        <w:tc>
-          <w:tcPr>
-            <w:tcW w:w="1498" w:type="pct"/>
+            <w:tcW w:w="1531" w:type="pct"/>
             <w:vAlign w:val="center"/>
           </w:tcPr>
           <w:p>
@@ -1809,7 +2278,7 @@
         </w:tc>
         <w:tc>
           <w:tcPr>
-            <w:tcW w:w="585" w:type="pct"/>
+            <w:tcW w:w="533" w:type="pct"/>
             <w:vMerge/>
             <w:vAlign w:val="center"/>
           </w:tcPr>
@@ -1827,41 +2296,92 @@
         </w:tc>
         <w:tc>
           <w:tcPr>
-            <w:tcW w:w="449" w:type="pct"/>
-            <w:vAlign w:val="center"/>
-          </w:tcPr>
-          <w:p>
-            <w:pPr>
-              <w:spacing w:before="40" w:after="40"/>
-              <w:jc w:val="center"/>
-              <w:rPr>
-                <w:rFonts w:ascii="Aptos Display" w:eastAsiaTheme="minorHAnsi" w:hAnsi="Aptos Display"/>
-                <w:sz w:val="20"/>
-                <w:szCs w:val="20"/>
-              </w:rPr>
-            </w:pPr>
-          </w:p>
-        </w:tc>
-        <w:tc>
-          <w:tcPr>
-            <w:tcW w:w="449" w:type="pct"/>
-            <w:vAlign w:val="center"/>
-          </w:tcPr>
-          <w:p>
-            <w:pPr>
-              <w:spacing w:before="40" w:after="40"/>
-              <w:jc w:val="center"/>
-              <w:rPr>
-                <w:rFonts w:ascii="Aptos Display" w:eastAsiaTheme="minorHAnsi" w:hAnsi="Aptos Display"/>
-                <w:sz w:val="20"/>
-                <w:szCs w:val="20"/>
-              </w:rPr>
-            </w:pPr>
-          </w:p>
-        </w:tc>
-        <w:tc>
-          <w:tcPr>
-            <w:tcW w:w="384" w:type="pct"/>
+            <w:tcW w:w="267" w:type="pct"/>
+            <w:vAlign w:val="center"/>
+          </w:tcPr>
+          <w:p>
+            <w:pPr>
+              <w:spacing w:before="40" w:after="40"/>
+              <w:jc w:val="center"/>
+              <w:rPr>
+                <w:rFonts w:ascii="Aptos Display" w:eastAsiaTheme="minorHAnsi" w:hAnsi="Aptos Display"/>
+                <w:sz w:val="20"/>
+                <w:szCs w:val="20"/>
+              </w:rPr>
+            </w:pPr>
+          </w:p>
+        </w:tc>
+        <w:tc>
+          <w:tcPr>
+            <w:tcW w:w="266" w:type="pct"/>
+            <w:vAlign w:val="center"/>
+          </w:tcPr>
+          <w:p>
+            <w:pPr>
+              <w:spacing w:before="40" w:after="40"/>
+              <w:jc w:val="center"/>
+              <w:rPr>
+                <w:rFonts w:ascii="Aptos Display" w:eastAsiaTheme="minorHAnsi" w:hAnsi="Aptos Display"/>
+                <w:sz w:val="20"/>
+                <w:szCs w:val="20"/>
+              </w:rPr>
+            </w:pPr>
+          </w:p>
+        </w:tc>
+        <w:tc>
+          <w:tcPr>
+            <w:tcW w:w="265" w:type="pct"/>
+            <w:vAlign w:val="center"/>
+          </w:tcPr>
+          <w:p>
+            <w:pPr>
+              <w:spacing w:before="40" w:after="40"/>
+              <w:jc w:val="center"/>
+              <w:rPr>
+                <w:rFonts w:ascii="Aptos Display" w:eastAsiaTheme="minorHAnsi" w:hAnsi="Aptos Display"/>
+                <w:sz w:val="20"/>
+                <w:szCs w:val="20"/>
+              </w:rPr>
+            </w:pPr>
+          </w:p>
+        </w:tc>
+        <w:tc>
+          <w:tcPr>
+            <w:tcW w:w="267" w:type="pct"/>
+            <w:vAlign w:val="center"/>
+          </w:tcPr>
+          <w:p>
+            <w:pPr>
+              <w:spacing w:before="40" w:after="40"/>
+              <w:jc w:val="center"/>
+              <w:rPr>
+                <w:rFonts w:ascii="Aptos Display" w:eastAsiaTheme="minorHAnsi" w:hAnsi="Aptos Display"/>
+                <w:sz w:val="20"/>
+                <w:szCs w:val="20"/>
+              </w:rPr>
+            </w:pPr>
+          </w:p>
+        </w:tc>
+        <w:tc>
+          <w:tcPr>
+            <w:tcW w:w="266" w:type="pct"/>
+            <w:vAlign w:val="center"/>
+          </w:tcPr>
+          <w:p>
+            <w:pPr>
+              <w:spacing w:before="40" w:after="40"/>
+              <w:jc w:val="center"/>
+              <w:rPr>
+                <w:rFonts w:ascii="Aptos Display" w:eastAsiaTheme="minorHAnsi" w:hAnsi="Aptos Display"/>
+                <w:sz w:val="20"/>
+                <w:szCs w:val="20"/>
+              </w:rPr>
+            </w:pPr>
+          </w:p>
+        </w:tc>
+        <w:tc>
+          <w:tcPr>
+            <w:tcW w:w="269" w:type="pct"/>
             <w:vAlign w:val="center"/>
           </w:tcPr>
           <w:p>
@@ -1883,7 +2403,7 @@
         </w:trPr>
         <w:tc>
           <w:tcPr>
-            <w:tcW w:w="191" w:type="pct"/>
+            <w:tcW w:w="840" w:type="pct"/>
             <w:vMerge/>
             <w:vAlign w:val="center"/>
           </w:tcPr>
@@ -1901,7 +2421,7 @@
         </w:tc>
         <w:tc>
           <w:tcPr>
-            <w:tcW w:w="899" w:type="pct"/>
+            <w:tcW w:w="496" w:type="pct"/>
             <w:vMerge/>
             <w:vAlign w:val="center"/>
           </w:tcPr>
@@ -1919,25 +2439,7 @@
         </w:tc>
         <w:tc>
           <w:tcPr>
-            <w:tcW w:w="545" w:type="pct"/>
-            <w:vMerge/>
-            <w:vAlign w:val="center"/>
-          </w:tcPr>
-          <w:p>
-            <w:pPr>
-              <w:spacing w:before="40" w:after="40"/>
-              <w:jc w:val="center"/>
-              <w:rPr>
-                <w:rFonts w:ascii="Aptos Display" w:eastAsiaTheme="minorHAnsi" w:hAnsi="Aptos Display"/>
-                <w:sz w:val="20"/>
-                <w:szCs w:val="20"/>
-              </w:rPr>
-            </w:pPr>
-          </w:p>
-        </w:tc>
-        <w:tc>
-          <w:tcPr>
-            <w:tcW w:w="1498" w:type="pct"/>
+            <w:tcW w:w="1531" w:type="pct"/>
             <w:vAlign w:val="center"/>
           </w:tcPr>
           <w:p>
@@ -1971,7 +2473,7 @@
         </w:tc>
         <w:tc>
           <w:tcPr>
-            <w:tcW w:w="585" w:type="pct"/>
+            <w:tcW w:w="533" w:type="pct"/>
             <w:vMerge/>
             <w:vAlign w:val="center"/>
           </w:tcPr>
@@ -1989,41 +2491,92 @@
         </w:tc>
         <w:tc>
           <w:tcPr>
-            <w:tcW w:w="449" w:type="pct"/>
-            <w:vAlign w:val="center"/>
-          </w:tcPr>
-          <w:p>
-            <w:pPr>
-              <w:spacing w:before="40" w:after="40"/>
-              <w:jc w:val="center"/>
-              <w:rPr>
-                <w:rFonts w:ascii="Aptos Display" w:eastAsiaTheme="minorHAnsi" w:hAnsi="Aptos Display"/>
-                <w:sz w:val="20"/>
-                <w:szCs w:val="20"/>
-              </w:rPr>
-            </w:pPr>
-          </w:p>
-        </w:tc>
-        <w:tc>
-          <w:tcPr>
-            <w:tcW w:w="449" w:type="pct"/>
-            <w:vAlign w:val="center"/>
-          </w:tcPr>
-          <w:p>
-            <w:pPr>
-              <w:spacing w:before="40" w:after="40"/>
-              <w:jc w:val="center"/>
-              <w:rPr>
-                <w:rFonts w:ascii="Aptos Display" w:eastAsiaTheme="minorHAnsi" w:hAnsi="Aptos Display"/>
-                <w:sz w:val="20"/>
-                <w:szCs w:val="20"/>
-              </w:rPr>
-            </w:pPr>
-          </w:p>
-        </w:tc>
-        <w:tc>
-          <w:tcPr>
-            <w:tcW w:w="384" w:type="pct"/>
+            <w:tcW w:w="267" w:type="pct"/>
+            <w:vAlign w:val="center"/>
+          </w:tcPr>
+          <w:p>
+            <w:pPr>
+              <w:spacing w:before="40" w:after="40"/>
+              <w:jc w:val="center"/>
+              <w:rPr>
+                <w:rFonts w:ascii="Aptos Display" w:eastAsiaTheme="minorHAnsi" w:hAnsi="Aptos Display"/>
+                <w:sz w:val="20"/>
+                <w:szCs w:val="20"/>
+              </w:rPr>
+            </w:pPr>
+          </w:p>
+        </w:tc>
+        <w:tc>
+          <w:tcPr>
+            <w:tcW w:w="266" w:type="pct"/>
+            <w:vAlign w:val="center"/>
+          </w:tcPr>
+          <w:p>
+            <w:pPr>
+              <w:spacing w:before="40" w:after="40"/>
+              <w:jc w:val="center"/>
+              <w:rPr>
+                <w:rFonts w:ascii="Aptos Display" w:eastAsiaTheme="minorHAnsi" w:hAnsi="Aptos Display"/>
+                <w:sz w:val="20"/>
+                <w:szCs w:val="20"/>
+              </w:rPr>
+            </w:pPr>
+          </w:p>
+        </w:tc>
+        <w:tc>
+          <w:tcPr>
+            <w:tcW w:w="265" w:type="pct"/>
+            <w:vAlign w:val="center"/>
+          </w:tcPr>
+          <w:p>
+            <w:pPr>
+              <w:spacing w:before="40" w:after="40"/>
+              <w:jc w:val="center"/>
+              <w:rPr>
+                <w:rFonts w:ascii="Aptos Display" w:eastAsiaTheme="minorHAnsi" w:hAnsi="Aptos Display"/>
+                <w:sz w:val="20"/>
+                <w:szCs w:val="20"/>
+              </w:rPr>
+            </w:pPr>
+          </w:p>
+        </w:tc>
+        <w:tc>
+          <w:tcPr>
+            <w:tcW w:w="267" w:type="pct"/>
+            <w:vAlign w:val="center"/>
+          </w:tcPr>
+          <w:p>
+            <w:pPr>
+              <w:spacing w:before="40" w:after="40"/>
+              <w:jc w:val="center"/>
+              <w:rPr>
+                <w:rFonts w:ascii="Aptos Display" w:eastAsiaTheme="minorHAnsi" w:hAnsi="Aptos Display"/>
+                <w:sz w:val="20"/>
+                <w:szCs w:val="20"/>
+              </w:rPr>
+            </w:pPr>
+          </w:p>
+        </w:tc>
+        <w:tc>
+          <w:tcPr>
+            <w:tcW w:w="266" w:type="pct"/>
+            <w:vAlign w:val="center"/>
+          </w:tcPr>
+          <w:p>
+            <w:pPr>
+              <w:spacing w:before="40" w:after="40"/>
+              <w:jc w:val="center"/>
+              <w:rPr>
+                <w:rFonts w:ascii="Aptos Display" w:eastAsiaTheme="minorHAnsi" w:hAnsi="Aptos Display"/>
+                <w:sz w:val="20"/>
+                <w:szCs w:val="20"/>
+              </w:rPr>
+            </w:pPr>
+          </w:p>
+        </w:tc>
+        <w:tc>
+          <w:tcPr>
+            <w:tcW w:w="269" w:type="pct"/>
             <w:vAlign w:val="center"/>
           </w:tcPr>
           <w:p>
@@ -2045,7 +2598,7 @@
         </w:trPr>
         <w:tc>
           <w:tcPr>
-            <w:tcW w:w="191" w:type="pct"/>
+            <w:tcW w:w="840" w:type="pct"/>
             <w:vMerge/>
             <w:vAlign w:val="center"/>
           </w:tcPr>
@@ -2063,7 +2616,7 @@
         </w:tc>
         <w:tc>
           <w:tcPr>
-            <w:tcW w:w="899" w:type="pct"/>
+            <w:tcW w:w="496" w:type="pct"/>
             <w:vMerge/>
             <w:vAlign w:val="center"/>
           </w:tcPr>
@@ -2081,25 +2634,7 @@
         </w:tc>
         <w:tc>
           <w:tcPr>
-            <w:tcW w:w="545" w:type="pct"/>
-            <w:vMerge/>
-            <w:vAlign w:val="center"/>
-          </w:tcPr>
-          <w:p>
-            <w:pPr>
-              <w:spacing w:before="40" w:after="40"/>
-              <w:jc w:val="center"/>
-              <w:rPr>
-                <w:rFonts w:ascii="Aptos Display" w:eastAsiaTheme="minorHAnsi" w:hAnsi="Aptos Display"/>
-                <w:sz w:val="20"/>
-                <w:szCs w:val="20"/>
-              </w:rPr>
-            </w:pPr>
-          </w:p>
-        </w:tc>
-        <w:tc>
-          <w:tcPr>
-            <w:tcW w:w="1498" w:type="pct"/>
+            <w:tcW w:w="1531" w:type="pct"/>
             <w:vAlign w:val="center"/>
           </w:tcPr>
           <w:p>
@@ -2133,7 +2668,7 @@
         </w:tc>
         <w:tc>
           <w:tcPr>
-            <w:tcW w:w="585" w:type="pct"/>
+            <w:tcW w:w="533" w:type="pct"/>
             <w:vMerge/>
             <w:vAlign w:val="center"/>
           </w:tcPr>
@@ -2151,41 +2686,92 @@
         </w:tc>
         <w:tc>
           <w:tcPr>
-            <w:tcW w:w="449" w:type="pct"/>
-            <w:vAlign w:val="center"/>
-          </w:tcPr>
-          <w:p>
-            <w:pPr>
-              <w:spacing w:before="40" w:after="40"/>
-              <w:jc w:val="center"/>
-              <w:rPr>
-                <w:rFonts w:ascii="Aptos Display" w:eastAsiaTheme="minorHAnsi" w:hAnsi="Aptos Display"/>
-                <w:sz w:val="20"/>
-                <w:szCs w:val="20"/>
-              </w:rPr>
-            </w:pPr>
-          </w:p>
-        </w:tc>
-        <w:tc>
-          <w:tcPr>
-            <w:tcW w:w="449" w:type="pct"/>
-            <w:vAlign w:val="center"/>
-          </w:tcPr>
-          <w:p>
-            <w:pPr>
-              <w:spacing w:before="40" w:after="40"/>
-              <w:jc w:val="center"/>
-              <w:rPr>
-                <w:rFonts w:ascii="Aptos Display" w:eastAsiaTheme="minorHAnsi" w:hAnsi="Aptos Display"/>
-                <w:sz w:val="20"/>
-                <w:szCs w:val="20"/>
-              </w:rPr>
-            </w:pPr>
-          </w:p>
-        </w:tc>
-        <w:tc>
-          <w:tcPr>
-            <w:tcW w:w="384" w:type="pct"/>
+            <w:tcW w:w="267" w:type="pct"/>
+            <w:vAlign w:val="center"/>
+          </w:tcPr>
+          <w:p>
+            <w:pPr>
+              <w:spacing w:before="40" w:after="40"/>
+              <w:jc w:val="center"/>
+              <w:rPr>
+                <w:rFonts w:ascii="Aptos Display" w:eastAsiaTheme="minorHAnsi" w:hAnsi="Aptos Display"/>
+                <w:sz w:val="20"/>
+                <w:szCs w:val="20"/>
+              </w:rPr>
+            </w:pPr>
+          </w:p>
+        </w:tc>
+        <w:tc>
+          <w:tcPr>
+            <w:tcW w:w="266" w:type="pct"/>
+            <w:vAlign w:val="center"/>
+          </w:tcPr>
+          <w:p>
+            <w:pPr>
+              <w:spacing w:before="40" w:after="40"/>
+              <w:jc w:val="center"/>
+              <w:rPr>
+                <w:rFonts w:ascii="Aptos Display" w:eastAsiaTheme="minorHAnsi" w:hAnsi="Aptos Display"/>
+                <w:sz w:val="20"/>
+                <w:szCs w:val="20"/>
+              </w:rPr>
+            </w:pPr>
+          </w:p>
+        </w:tc>
+        <w:tc>
+          <w:tcPr>
+            <w:tcW w:w="265" w:type="pct"/>
+            <w:vAlign w:val="center"/>
+          </w:tcPr>
+          <w:p>
+            <w:pPr>
+              <w:spacing w:before="40" w:after="40"/>
+              <w:jc w:val="center"/>
+              <w:rPr>
+                <w:rFonts w:ascii="Aptos Display" w:eastAsiaTheme="minorHAnsi" w:hAnsi="Aptos Display"/>
+                <w:sz w:val="20"/>
+                <w:szCs w:val="20"/>
+              </w:rPr>
+            </w:pPr>
+          </w:p>
+        </w:tc>
+        <w:tc>
+          <w:tcPr>
+            <w:tcW w:w="267" w:type="pct"/>
+            <w:vAlign w:val="center"/>
+          </w:tcPr>
+          <w:p>
+            <w:pPr>
+              <w:spacing w:before="40" w:after="40"/>
+              <w:jc w:val="center"/>
+              <w:rPr>
+                <w:rFonts w:ascii="Aptos Display" w:eastAsiaTheme="minorHAnsi" w:hAnsi="Aptos Display"/>
+                <w:sz w:val="20"/>
+                <w:szCs w:val="20"/>
+              </w:rPr>
+            </w:pPr>
+          </w:p>
+        </w:tc>
+        <w:tc>
+          <w:tcPr>
+            <w:tcW w:w="266" w:type="pct"/>
+            <w:vAlign w:val="center"/>
+          </w:tcPr>
+          <w:p>
+            <w:pPr>
+              <w:spacing w:before="40" w:after="40"/>
+              <w:jc w:val="center"/>
+              <w:rPr>
+                <w:rFonts w:ascii="Aptos Display" w:eastAsiaTheme="minorHAnsi" w:hAnsi="Aptos Display"/>
+                <w:sz w:val="20"/>
+                <w:szCs w:val="20"/>
+              </w:rPr>
+            </w:pPr>
+          </w:p>
+        </w:tc>
+        <w:tc>
+          <w:tcPr>
+            <w:tcW w:w="269" w:type="pct"/>
             <w:vAlign w:val="center"/>
           </w:tcPr>
           <w:p>
@@ -2207,7 +2793,7 @@
         </w:trPr>
         <w:tc>
           <w:tcPr>
-            <w:tcW w:w="191" w:type="pct"/>
+            <w:tcW w:w="840" w:type="pct"/>
             <w:vMerge/>
             <w:vAlign w:val="center"/>
           </w:tcPr>
@@ -2225,7 +2811,7 @@
         </w:tc>
         <w:tc>
           <w:tcPr>
-            <w:tcW w:w="899" w:type="pct"/>
+            <w:tcW w:w="496" w:type="pct"/>
             <w:vMerge/>
             <w:vAlign w:val="center"/>
           </w:tcPr>
@@ -2243,25 +2829,7 @@
         </w:tc>
         <w:tc>
           <w:tcPr>
-            <w:tcW w:w="545" w:type="pct"/>
-            <w:vMerge/>
-            <w:vAlign w:val="center"/>
-          </w:tcPr>
-          <w:p>
-            <w:pPr>
-              <w:spacing w:before="40" w:after="40"/>
-              <w:jc w:val="center"/>
-              <w:rPr>
-                <w:rFonts w:ascii="Aptos Display" w:eastAsiaTheme="minorHAnsi" w:hAnsi="Aptos Display"/>
-                <w:sz w:val="20"/>
-                <w:szCs w:val="20"/>
-              </w:rPr>
-            </w:pPr>
-          </w:p>
-        </w:tc>
-        <w:tc>
-          <w:tcPr>
-            <w:tcW w:w="1498" w:type="pct"/>
+            <w:tcW w:w="1531" w:type="pct"/>
             <w:vAlign w:val="center"/>
           </w:tcPr>
           <w:p>
@@ -2295,7 +2863,7 @@
         </w:tc>
         <w:tc>
           <w:tcPr>
-            <w:tcW w:w="585" w:type="pct"/>
+            <w:tcW w:w="533" w:type="pct"/>
             <w:vMerge/>
             <w:vAlign w:val="center"/>
           </w:tcPr>
@@ -2313,41 +2881,92 @@
         </w:tc>
         <w:tc>
           <w:tcPr>
-            <w:tcW w:w="449" w:type="pct"/>
-            <w:vAlign w:val="center"/>
-          </w:tcPr>
-          <w:p>
-            <w:pPr>
-              <w:spacing w:before="40" w:after="40"/>
-              <w:jc w:val="center"/>
-              <w:rPr>
-                <w:rFonts w:ascii="Aptos Display" w:eastAsiaTheme="minorHAnsi" w:hAnsi="Aptos Display"/>
-                <w:sz w:val="20"/>
-                <w:szCs w:val="20"/>
-              </w:rPr>
-            </w:pPr>
-          </w:p>
-        </w:tc>
-        <w:tc>
-          <w:tcPr>
-            <w:tcW w:w="449" w:type="pct"/>
-            <w:vAlign w:val="center"/>
-          </w:tcPr>
-          <w:p>
-            <w:pPr>
-              <w:spacing w:before="40" w:after="40"/>
-              <w:jc w:val="center"/>
-              <w:rPr>
-                <w:rFonts w:ascii="Aptos Display" w:eastAsiaTheme="minorHAnsi" w:hAnsi="Aptos Display"/>
-                <w:sz w:val="20"/>
-                <w:szCs w:val="20"/>
-              </w:rPr>
-            </w:pPr>
-          </w:p>
-        </w:tc>
-        <w:tc>
-          <w:tcPr>
-            <w:tcW w:w="384" w:type="pct"/>
+            <w:tcW w:w="267" w:type="pct"/>
+            <w:vAlign w:val="center"/>
+          </w:tcPr>
+          <w:p>
+            <w:pPr>
+              <w:spacing w:before="40" w:after="40"/>
+              <w:jc w:val="center"/>
+              <w:rPr>
+                <w:rFonts w:ascii="Aptos Display" w:eastAsiaTheme="minorHAnsi" w:hAnsi="Aptos Display"/>
+                <w:sz w:val="20"/>
+                <w:szCs w:val="20"/>
+              </w:rPr>
+            </w:pPr>
+          </w:p>
+        </w:tc>
+        <w:tc>
+          <w:tcPr>
+            <w:tcW w:w="266" w:type="pct"/>
+            <w:vAlign w:val="center"/>
+          </w:tcPr>
+          <w:p>
+            <w:pPr>
+              <w:spacing w:before="40" w:after="40"/>
+              <w:jc w:val="center"/>
+              <w:rPr>
+                <w:rFonts w:ascii="Aptos Display" w:eastAsiaTheme="minorHAnsi" w:hAnsi="Aptos Display"/>
+                <w:sz w:val="20"/>
+                <w:szCs w:val="20"/>
+              </w:rPr>
+            </w:pPr>
+          </w:p>
+        </w:tc>
+        <w:tc>
+          <w:tcPr>
+            <w:tcW w:w="265" w:type="pct"/>
+            <w:vAlign w:val="center"/>
+          </w:tcPr>
+          <w:p>
+            <w:pPr>
+              <w:spacing w:before="40" w:after="40"/>
+              <w:jc w:val="center"/>
+              <w:rPr>
+                <w:rFonts w:ascii="Aptos Display" w:eastAsiaTheme="minorHAnsi" w:hAnsi="Aptos Display"/>
+                <w:sz w:val="20"/>
+                <w:szCs w:val="20"/>
+              </w:rPr>
+            </w:pPr>
+          </w:p>
+        </w:tc>
+        <w:tc>
+          <w:tcPr>
+            <w:tcW w:w="267" w:type="pct"/>
+            <w:vAlign w:val="center"/>
+          </w:tcPr>
+          <w:p>
+            <w:pPr>
+              <w:spacing w:before="40" w:after="40"/>
+              <w:jc w:val="center"/>
+              <w:rPr>
+                <w:rFonts w:ascii="Aptos Display" w:eastAsiaTheme="minorHAnsi" w:hAnsi="Aptos Display"/>
+                <w:sz w:val="20"/>
+                <w:szCs w:val="20"/>
+              </w:rPr>
+            </w:pPr>
+          </w:p>
+        </w:tc>
+        <w:tc>
+          <w:tcPr>
+            <w:tcW w:w="266" w:type="pct"/>
+            <w:vAlign w:val="center"/>
+          </w:tcPr>
+          <w:p>
+            <w:pPr>
+              <w:spacing w:before="40" w:after="40"/>
+              <w:jc w:val="center"/>
+              <w:rPr>
+                <w:rFonts w:ascii="Aptos Display" w:eastAsiaTheme="minorHAnsi" w:hAnsi="Aptos Display"/>
+                <w:sz w:val="20"/>
+                <w:szCs w:val="20"/>
+              </w:rPr>
+            </w:pPr>
+          </w:p>
+        </w:tc>
+        <w:tc>
+          <w:tcPr>
+            <w:tcW w:w="269" w:type="pct"/>
             <w:vAlign w:val="center"/>
           </w:tcPr>
           <w:p>
@@ -2369,7 +2988,7 @@
         </w:trPr>
         <w:tc>
           <w:tcPr>
-            <w:tcW w:w="191" w:type="pct"/>
+            <w:tcW w:w="840" w:type="pct"/>
             <w:vMerge/>
             <w:vAlign w:val="center"/>
           </w:tcPr>
@@ -2387,7 +3006,7 @@
         </w:tc>
         <w:tc>
           <w:tcPr>
-            <w:tcW w:w="899" w:type="pct"/>
+            <w:tcW w:w="496" w:type="pct"/>
             <w:vMerge/>
             <w:vAlign w:val="center"/>
           </w:tcPr>
@@ -2405,25 +3024,7 @@
         </w:tc>
         <w:tc>
           <w:tcPr>
-            <w:tcW w:w="545" w:type="pct"/>
-            <w:vMerge/>
-            <w:vAlign w:val="center"/>
-          </w:tcPr>
-          <w:p>
-            <w:pPr>
-              <w:spacing w:before="40" w:after="40"/>
-              <w:jc w:val="center"/>
-              <w:rPr>
-                <w:rFonts w:ascii="Aptos Display" w:eastAsiaTheme="minorHAnsi" w:hAnsi="Aptos Display"/>
-                <w:sz w:val="20"/>
-                <w:szCs w:val="20"/>
-              </w:rPr>
-            </w:pPr>
-          </w:p>
-        </w:tc>
-        <w:tc>
-          <w:tcPr>
-            <w:tcW w:w="1498" w:type="pct"/>
+            <w:tcW w:w="1531" w:type="pct"/>
             <w:vAlign w:val="center"/>
           </w:tcPr>
           <w:p>
@@ -2457,7 +3058,7 @@
         </w:tc>
         <w:tc>
           <w:tcPr>
-            <w:tcW w:w="585" w:type="pct"/>
+            <w:tcW w:w="533" w:type="pct"/>
             <w:vMerge/>
             <w:vAlign w:val="center"/>
           </w:tcPr>
@@ -2475,41 +3076,92 @@
         </w:tc>
         <w:tc>
           <w:tcPr>
-            <w:tcW w:w="449" w:type="pct"/>
-            <w:vAlign w:val="center"/>
-          </w:tcPr>
-          <w:p>
-            <w:pPr>
-              <w:spacing w:before="40" w:after="40"/>
-              <w:jc w:val="center"/>
-              <w:rPr>
-                <w:rFonts w:ascii="Aptos Display" w:eastAsiaTheme="minorHAnsi" w:hAnsi="Aptos Display"/>
-                <w:sz w:val="20"/>
-                <w:szCs w:val="20"/>
-              </w:rPr>
-            </w:pPr>
-          </w:p>
-        </w:tc>
-        <w:tc>
-          <w:tcPr>
-            <w:tcW w:w="449" w:type="pct"/>
-            <w:vAlign w:val="center"/>
-          </w:tcPr>
-          <w:p>
-            <w:pPr>
-              <w:spacing w:before="40" w:after="40"/>
-              <w:jc w:val="center"/>
-              <w:rPr>
-                <w:rFonts w:ascii="Aptos Display" w:eastAsiaTheme="minorHAnsi" w:hAnsi="Aptos Display"/>
-                <w:sz w:val="20"/>
-                <w:szCs w:val="20"/>
-              </w:rPr>
-            </w:pPr>
-          </w:p>
-        </w:tc>
-        <w:tc>
-          <w:tcPr>
-            <w:tcW w:w="384" w:type="pct"/>
+            <w:tcW w:w="267" w:type="pct"/>
+            <w:vAlign w:val="center"/>
+          </w:tcPr>
+          <w:p>
+            <w:pPr>
+              <w:spacing w:before="40" w:after="40"/>
+              <w:jc w:val="center"/>
+              <w:rPr>
+                <w:rFonts w:ascii="Aptos Display" w:eastAsiaTheme="minorHAnsi" w:hAnsi="Aptos Display"/>
+                <w:sz w:val="20"/>
+                <w:szCs w:val="20"/>
+              </w:rPr>
+            </w:pPr>
+          </w:p>
+        </w:tc>
+        <w:tc>
+          <w:tcPr>
+            <w:tcW w:w="266" w:type="pct"/>
+            <w:vAlign w:val="center"/>
+          </w:tcPr>
+          <w:p>
+            <w:pPr>
+              <w:spacing w:before="40" w:after="40"/>
+              <w:jc w:val="center"/>
+              <w:rPr>
+                <w:rFonts w:ascii="Aptos Display" w:eastAsiaTheme="minorHAnsi" w:hAnsi="Aptos Display"/>
+                <w:sz w:val="20"/>
+                <w:szCs w:val="20"/>
+              </w:rPr>
+            </w:pPr>
+          </w:p>
+        </w:tc>
+        <w:tc>
+          <w:tcPr>
+            <w:tcW w:w="265" w:type="pct"/>
+            <w:vAlign w:val="center"/>
+          </w:tcPr>
+          <w:p>
+            <w:pPr>
+              <w:spacing w:before="40" w:after="40"/>
+              <w:jc w:val="center"/>
+              <w:rPr>
+                <w:rFonts w:ascii="Aptos Display" w:eastAsiaTheme="minorHAnsi" w:hAnsi="Aptos Display"/>
+                <w:sz w:val="20"/>
+                <w:szCs w:val="20"/>
+              </w:rPr>
+            </w:pPr>
+          </w:p>
+        </w:tc>
+        <w:tc>
+          <w:tcPr>
+            <w:tcW w:w="267" w:type="pct"/>
+            <w:vAlign w:val="center"/>
+          </w:tcPr>
+          <w:p>
+            <w:pPr>
+              <w:spacing w:before="40" w:after="40"/>
+              <w:jc w:val="center"/>
+              <w:rPr>
+                <w:rFonts w:ascii="Aptos Display" w:eastAsiaTheme="minorHAnsi" w:hAnsi="Aptos Display"/>
+                <w:sz w:val="20"/>
+                <w:szCs w:val="20"/>
+              </w:rPr>
+            </w:pPr>
+          </w:p>
+        </w:tc>
+        <w:tc>
+          <w:tcPr>
+            <w:tcW w:w="266" w:type="pct"/>
+            <w:vAlign w:val="center"/>
+          </w:tcPr>
+          <w:p>
+            <w:pPr>
+              <w:spacing w:before="40" w:after="40"/>
+              <w:jc w:val="center"/>
+              <w:rPr>
+                <w:rFonts w:ascii="Aptos Display" w:eastAsiaTheme="minorHAnsi" w:hAnsi="Aptos Display"/>
+                <w:sz w:val="20"/>
+                <w:szCs w:val="20"/>
+              </w:rPr>
+            </w:pPr>
+          </w:p>
+        </w:tc>
+        <w:tc>
+          <w:tcPr>
+            <w:tcW w:w="269" w:type="pct"/>
             <w:vAlign w:val="center"/>
           </w:tcPr>
           <w:p>
@@ -2531,7 +3183,7 @@
         </w:trPr>
         <w:tc>
           <w:tcPr>
-            <w:tcW w:w="191" w:type="pct"/>
+            <w:tcW w:w="840" w:type="pct"/>
             <w:vMerge/>
             <w:vAlign w:val="center"/>
           </w:tcPr>
@@ -2549,7 +3201,7 @@
         </w:tc>
         <w:tc>
           <w:tcPr>
-            <w:tcW w:w="899" w:type="pct"/>
+            <w:tcW w:w="496" w:type="pct"/>
             <w:vMerge/>
             <w:vAlign w:val="center"/>
           </w:tcPr>
@@ -2567,25 +3219,7 @@
         </w:tc>
         <w:tc>
           <w:tcPr>
-            <w:tcW w:w="545" w:type="pct"/>
-            <w:vMerge/>
-            <w:vAlign w:val="center"/>
-          </w:tcPr>
-          <w:p>
-            <w:pPr>
-              <w:spacing w:before="40" w:after="40"/>
-              <w:jc w:val="center"/>
-              <w:rPr>
-                <w:rFonts w:ascii="Aptos Display" w:eastAsiaTheme="minorHAnsi" w:hAnsi="Aptos Display"/>
-                <w:sz w:val="20"/>
-                <w:szCs w:val="20"/>
-              </w:rPr>
-            </w:pPr>
-          </w:p>
-        </w:tc>
-        <w:tc>
-          <w:tcPr>
-            <w:tcW w:w="1498" w:type="pct"/>
+            <w:tcW w:w="1531" w:type="pct"/>
             <w:vAlign w:val="center"/>
           </w:tcPr>
           <w:p>
@@ -2620,7 +3254,7 @@
         </w:tc>
         <w:tc>
           <w:tcPr>
-            <w:tcW w:w="585" w:type="pct"/>
+            <w:tcW w:w="533" w:type="pct"/>
             <w:vMerge/>
             <w:vAlign w:val="center"/>
           </w:tcPr>
@@ -2638,41 +3272,92 @@
         </w:tc>
         <w:tc>
           <w:tcPr>
-            <w:tcW w:w="449" w:type="pct"/>
-            <w:vAlign w:val="center"/>
-          </w:tcPr>
-          <w:p>
-            <w:pPr>
-              <w:spacing w:before="40" w:after="40"/>
-              <w:jc w:val="center"/>
-              <w:rPr>
-                <w:rFonts w:ascii="Aptos Display" w:eastAsiaTheme="minorHAnsi" w:hAnsi="Aptos Display"/>
-                <w:sz w:val="20"/>
-                <w:szCs w:val="20"/>
-              </w:rPr>
-            </w:pPr>
-          </w:p>
-        </w:tc>
-        <w:tc>
-          <w:tcPr>
-            <w:tcW w:w="449" w:type="pct"/>
-            <w:vAlign w:val="center"/>
-          </w:tcPr>
-          <w:p>
-            <w:pPr>
-              <w:spacing w:before="40" w:after="40"/>
-              <w:jc w:val="center"/>
-              <w:rPr>
-                <w:rFonts w:ascii="Aptos Display" w:eastAsiaTheme="minorHAnsi" w:hAnsi="Aptos Display"/>
-                <w:sz w:val="20"/>
-                <w:szCs w:val="20"/>
-              </w:rPr>
-            </w:pPr>
-          </w:p>
-        </w:tc>
-        <w:tc>
-          <w:tcPr>
-            <w:tcW w:w="384" w:type="pct"/>
+            <w:tcW w:w="267" w:type="pct"/>
+            <w:vAlign w:val="center"/>
+          </w:tcPr>
+          <w:p>
+            <w:pPr>
+              <w:spacing w:before="40" w:after="40"/>
+              <w:jc w:val="center"/>
+              <w:rPr>
+                <w:rFonts w:ascii="Aptos Display" w:eastAsiaTheme="minorHAnsi" w:hAnsi="Aptos Display"/>
+                <w:sz w:val="20"/>
+                <w:szCs w:val="20"/>
+              </w:rPr>
+            </w:pPr>
+          </w:p>
+        </w:tc>
+        <w:tc>
+          <w:tcPr>
+            <w:tcW w:w="266" w:type="pct"/>
+            <w:vAlign w:val="center"/>
+          </w:tcPr>
+          <w:p>
+            <w:pPr>
+              <w:spacing w:before="40" w:after="40"/>
+              <w:jc w:val="center"/>
+              <w:rPr>
+                <w:rFonts w:ascii="Aptos Display" w:eastAsiaTheme="minorHAnsi" w:hAnsi="Aptos Display"/>
+                <w:sz w:val="20"/>
+                <w:szCs w:val="20"/>
+              </w:rPr>
+            </w:pPr>
+          </w:p>
+        </w:tc>
+        <w:tc>
+          <w:tcPr>
+            <w:tcW w:w="265" w:type="pct"/>
+            <w:vAlign w:val="center"/>
+          </w:tcPr>
+          <w:p>
+            <w:pPr>
+              <w:spacing w:before="40" w:after="40"/>
+              <w:jc w:val="center"/>
+              <w:rPr>
+                <w:rFonts w:ascii="Aptos Display" w:eastAsiaTheme="minorHAnsi" w:hAnsi="Aptos Display"/>
+                <w:sz w:val="20"/>
+                <w:szCs w:val="20"/>
+              </w:rPr>
+            </w:pPr>
+          </w:p>
+        </w:tc>
+        <w:tc>
+          <w:tcPr>
+            <w:tcW w:w="267" w:type="pct"/>
+            <w:vAlign w:val="center"/>
+          </w:tcPr>
+          <w:p>
+            <w:pPr>
+              <w:spacing w:before="40" w:after="40"/>
+              <w:jc w:val="center"/>
+              <w:rPr>
+                <w:rFonts w:ascii="Aptos Display" w:eastAsiaTheme="minorHAnsi" w:hAnsi="Aptos Display"/>
+                <w:sz w:val="20"/>
+                <w:szCs w:val="20"/>
+              </w:rPr>
+            </w:pPr>
+          </w:p>
+        </w:tc>
+        <w:tc>
+          <w:tcPr>
+            <w:tcW w:w="266" w:type="pct"/>
+            <w:vAlign w:val="center"/>
+          </w:tcPr>
+          <w:p>
+            <w:pPr>
+              <w:spacing w:before="40" w:after="40"/>
+              <w:jc w:val="center"/>
+              <w:rPr>
+                <w:rFonts w:ascii="Aptos Display" w:eastAsiaTheme="minorHAnsi" w:hAnsi="Aptos Display"/>
+                <w:sz w:val="20"/>
+                <w:szCs w:val="20"/>
+              </w:rPr>
+            </w:pPr>
+          </w:p>
+        </w:tc>
+        <w:tc>
+          <w:tcPr>
+            <w:tcW w:w="269" w:type="pct"/>
             <w:vAlign w:val="center"/>
           </w:tcPr>
           <w:p>
@@ -2694,7 +3379,7 @@
         </w:trPr>
         <w:tc>
           <w:tcPr>
-            <w:tcW w:w="191" w:type="pct"/>
+            <w:tcW w:w="840" w:type="pct"/>
             <w:vMerge/>
             <w:vAlign w:val="center"/>
           </w:tcPr>
@@ -2712,7 +3397,7 @@
         </w:tc>
         <w:tc>
           <w:tcPr>
-            <w:tcW w:w="899" w:type="pct"/>
+            <w:tcW w:w="496" w:type="pct"/>
             <w:vMerge/>
             <w:vAlign w:val="center"/>
           </w:tcPr>
@@ -2730,25 +3415,7 @@
         </w:tc>
         <w:tc>
           <w:tcPr>
-            <w:tcW w:w="545" w:type="pct"/>
-            <w:vMerge/>
-            <w:vAlign w:val="center"/>
-          </w:tcPr>
-          <w:p>
-            <w:pPr>
-              <w:spacing w:before="40" w:after="40"/>
-              <w:jc w:val="center"/>
-              <w:rPr>
-                <w:rFonts w:ascii="Aptos Display" w:eastAsiaTheme="minorHAnsi" w:hAnsi="Aptos Display"/>
-                <w:sz w:val="20"/>
-                <w:szCs w:val="20"/>
-              </w:rPr>
-            </w:pPr>
-          </w:p>
-        </w:tc>
-        <w:tc>
-          <w:tcPr>
-            <w:tcW w:w="1498" w:type="pct"/>
+            <w:tcW w:w="1531" w:type="pct"/>
             <w:vAlign w:val="center"/>
           </w:tcPr>
           <w:p>
@@ -2782,7 +3449,7 @@
         </w:tc>
         <w:tc>
           <w:tcPr>
-            <w:tcW w:w="585" w:type="pct"/>
+            <w:tcW w:w="533" w:type="pct"/>
             <w:vMerge/>
             <w:vAlign w:val="center"/>
           </w:tcPr>
@@ -2800,41 +3467,92 @@
         </w:tc>
         <w:tc>
           <w:tcPr>
-            <w:tcW w:w="449" w:type="pct"/>
-            <w:vAlign w:val="center"/>
-          </w:tcPr>
-          <w:p>
-            <w:pPr>
-              <w:spacing w:before="40" w:after="40"/>
-              <w:jc w:val="center"/>
-              <w:rPr>
-                <w:rFonts w:ascii="Aptos Display" w:eastAsiaTheme="minorHAnsi" w:hAnsi="Aptos Display"/>
-                <w:sz w:val="20"/>
-                <w:szCs w:val="20"/>
-              </w:rPr>
-            </w:pPr>
-          </w:p>
-        </w:tc>
-        <w:tc>
-          <w:tcPr>
-            <w:tcW w:w="449" w:type="pct"/>
-            <w:vAlign w:val="center"/>
-          </w:tcPr>
-          <w:p>
-            <w:pPr>
-              <w:spacing w:before="40" w:after="40"/>
-              <w:jc w:val="center"/>
-              <w:rPr>
-                <w:rFonts w:ascii="Aptos Display" w:eastAsiaTheme="minorHAnsi" w:hAnsi="Aptos Display"/>
-                <w:sz w:val="20"/>
-                <w:szCs w:val="20"/>
-              </w:rPr>
-            </w:pPr>
-          </w:p>
-        </w:tc>
-        <w:tc>
-          <w:tcPr>
-            <w:tcW w:w="384" w:type="pct"/>
+            <w:tcW w:w="267" w:type="pct"/>
+            <w:vAlign w:val="center"/>
+          </w:tcPr>
+          <w:p>
+            <w:pPr>
+              <w:spacing w:before="40" w:after="40"/>
+              <w:jc w:val="center"/>
+              <w:rPr>
+                <w:rFonts w:ascii="Aptos Display" w:eastAsiaTheme="minorHAnsi" w:hAnsi="Aptos Display"/>
+                <w:sz w:val="20"/>
+                <w:szCs w:val="20"/>
+              </w:rPr>
+            </w:pPr>
+          </w:p>
+        </w:tc>
+        <w:tc>
+          <w:tcPr>
+            <w:tcW w:w="266" w:type="pct"/>
+            <w:vAlign w:val="center"/>
+          </w:tcPr>
+          <w:p>
+            <w:pPr>
+              <w:spacing w:before="40" w:after="40"/>
+              <w:jc w:val="center"/>
+              <w:rPr>
+                <w:rFonts w:ascii="Aptos Display" w:eastAsiaTheme="minorHAnsi" w:hAnsi="Aptos Display"/>
+                <w:sz w:val="20"/>
+                <w:szCs w:val="20"/>
+              </w:rPr>
+            </w:pPr>
+          </w:p>
+        </w:tc>
+        <w:tc>
+          <w:tcPr>
+            <w:tcW w:w="265" w:type="pct"/>
+            <w:vAlign w:val="center"/>
+          </w:tcPr>
+          <w:p>
+            <w:pPr>
+              <w:spacing w:before="40" w:after="40"/>
+              <w:jc w:val="center"/>
+              <w:rPr>
+                <w:rFonts w:ascii="Aptos Display" w:eastAsiaTheme="minorHAnsi" w:hAnsi="Aptos Display"/>
+                <w:sz w:val="20"/>
+                <w:szCs w:val="20"/>
+              </w:rPr>
+            </w:pPr>
+          </w:p>
+        </w:tc>
+        <w:tc>
+          <w:tcPr>
+            <w:tcW w:w="267" w:type="pct"/>
+            <w:vAlign w:val="center"/>
+          </w:tcPr>
+          <w:p>
+            <w:pPr>
+              <w:spacing w:before="40" w:after="40"/>
+              <w:jc w:val="center"/>
+              <w:rPr>
+                <w:rFonts w:ascii="Aptos Display" w:eastAsiaTheme="minorHAnsi" w:hAnsi="Aptos Display"/>
+                <w:sz w:val="20"/>
+                <w:szCs w:val="20"/>
+              </w:rPr>
+            </w:pPr>
+          </w:p>
+        </w:tc>
+        <w:tc>
+          <w:tcPr>
+            <w:tcW w:w="266" w:type="pct"/>
+            <w:vAlign w:val="center"/>
+          </w:tcPr>
+          <w:p>
+            <w:pPr>
+              <w:spacing w:before="40" w:after="40"/>
+              <w:jc w:val="center"/>
+              <w:rPr>
+                <w:rFonts w:ascii="Aptos Display" w:eastAsiaTheme="minorHAnsi" w:hAnsi="Aptos Display"/>
+                <w:sz w:val="20"/>
+                <w:szCs w:val="20"/>
+              </w:rPr>
+            </w:pPr>
+          </w:p>
+        </w:tc>
+        <w:tc>
+          <w:tcPr>
+            <w:tcW w:w="269" w:type="pct"/>
             <w:vAlign w:val="center"/>
           </w:tcPr>
           <w:p>
@@ -2856,7 +3574,7 @@
         </w:trPr>
         <w:tc>
           <w:tcPr>
-            <w:tcW w:w="191" w:type="pct"/>
+            <w:tcW w:w="840" w:type="pct"/>
             <w:vMerge/>
             <w:vAlign w:val="center"/>
           </w:tcPr>
@@ -2874,7 +3592,7 @@
         </w:tc>
         <w:tc>
           <w:tcPr>
-            <w:tcW w:w="899" w:type="pct"/>
+            <w:tcW w:w="496" w:type="pct"/>
             <w:vMerge/>
             <w:vAlign w:val="center"/>
           </w:tcPr>
@@ -2892,25 +3610,7 @@
         </w:tc>
         <w:tc>
           <w:tcPr>
-            <w:tcW w:w="545" w:type="pct"/>
-            <w:vMerge/>
-            <w:vAlign w:val="center"/>
-          </w:tcPr>
-          <w:p>
-            <w:pPr>
-              <w:spacing w:before="40" w:after="40"/>
-              <w:jc w:val="center"/>
-              <w:rPr>
-                <w:rFonts w:ascii="Aptos Display" w:eastAsiaTheme="minorHAnsi" w:hAnsi="Aptos Display"/>
-                <w:sz w:val="20"/>
-                <w:szCs w:val="20"/>
-              </w:rPr>
-            </w:pPr>
-          </w:p>
-        </w:tc>
-        <w:tc>
-          <w:tcPr>
-            <w:tcW w:w="1498" w:type="pct"/>
+            <w:tcW w:w="1531" w:type="pct"/>
             <w:vAlign w:val="center"/>
           </w:tcPr>
           <w:p>
@@ -2944,7 +3644,7 @@
         </w:tc>
         <w:tc>
           <w:tcPr>
-            <w:tcW w:w="585" w:type="pct"/>
+            <w:tcW w:w="533" w:type="pct"/>
             <w:vMerge/>
             <w:vAlign w:val="center"/>
           </w:tcPr>
@@ -2962,41 +3662,92 @@
         </w:tc>
         <w:tc>
           <w:tcPr>
-            <w:tcW w:w="449" w:type="pct"/>
-            <w:vAlign w:val="center"/>
-          </w:tcPr>
-          <w:p>
-            <w:pPr>
-              <w:spacing w:before="40" w:after="40"/>
-              <w:jc w:val="center"/>
-              <w:rPr>
-                <w:rFonts w:ascii="Aptos Display" w:eastAsiaTheme="minorHAnsi" w:hAnsi="Aptos Display"/>
-                <w:sz w:val="20"/>
-                <w:szCs w:val="20"/>
-              </w:rPr>
-            </w:pPr>
-          </w:p>
-        </w:tc>
-        <w:tc>
-          <w:tcPr>
-            <w:tcW w:w="449" w:type="pct"/>
-            <w:vAlign w:val="center"/>
-          </w:tcPr>
-          <w:p>
-            <w:pPr>
-              <w:spacing w:before="40" w:after="40"/>
-              <w:jc w:val="center"/>
-              <w:rPr>
-                <w:rFonts w:ascii="Aptos Display" w:eastAsiaTheme="minorHAnsi" w:hAnsi="Aptos Display"/>
-                <w:sz w:val="20"/>
-                <w:szCs w:val="20"/>
-              </w:rPr>
-            </w:pPr>
-          </w:p>
-        </w:tc>
-        <w:tc>
-          <w:tcPr>
-            <w:tcW w:w="384" w:type="pct"/>
+            <w:tcW w:w="267" w:type="pct"/>
+            <w:vAlign w:val="center"/>
+          </w:tcPr>
+          <w:p>
+            <w:pPr>
+              <w:spacing w:before="40" w:after="40"/>
+              <w:jc w:val="center"/>
+              <w:rPr>
+                <w:rFonts w:ascii="Aptos Display" w:eastAsiaTheme="minorHAnsi" w:hAnsi="Aptos Display"/>
+                <w:sz w:val="20"/>
+                <w:szCs w:val="20"/>
+              </w:rPr>
+            </w:pPr>
+          </w:p>
+        </w:tc>
+        <w:tc>
+          <w:tcPr>
+            <w:tcW w:w="266" w:type="pct"/>
+            <w:vAlign w:val="center"/>
+          </w:tcPr>
+          <w:p>
+            <w:pPr>
+              <w:spacing w:before="40" w:after="40"/>
+              <w:jc w:val="center"/>
+              <w:rPr>
+                <w:rFonts w:ascii="Aptos Display" w:eastAsiaTheme="minorHAnsi" w:hAnsi="Aptos Display"/>
+                <w:sz w:val="20"/>
+                <w:szCs w:val="20"/>
+              </w:rPr>
+            </w:pPr>
+          </w:p>
+        </w:tc>
+        <w:tc>
+          <w:tcPr>
+            <w:tcW w:w="265" w:type="pct"/>
+            <w:vAlign w:val="center"/>
+          </w:tcPr>
+          <w:p>
+            <w:pPr>
+              <w:spacing w:before="40" w:after="40"/>
+              <w:jc w:val="center"/>
+              <w:rPr>
+                <w:rFonts w:ascii="Aptos Display" w:eastAsiaTheme="minorHAnsi" w:hAnsi="Aptos Display"/>
+                <w:sz w:val="20"/>
+                <w:szCs w:val="20"/>
+              </w:rPr>
+            </w:pPr>
+          </w:p>
+        </w:tc>
+        <w:tc>
+          <w:tcPr>
+            <w:tcW w:w="267" w:type="pct"/>
+            <w:vAlign w:val="center"/>
+          </w:tcPr>
+          <w:p>
+            <w:pPr>
+              <w:spacing w:before="40" w:after="40"/>
+              <w:jc w:val="center"/>
+              <w:rPr>
+                <w:rFonts w:ascii="Aptos Display" w:eastAsiaTheme="minorHAnsi" w:hAnsi="Aptos Display"/>
+                <w:sz w:val="20"/>
+                <w:szCs w:val="20"/>
+              </w:rPr>
+            </w:pPr>
+          </w:p>
+        </w:tc>
+        <w:tc>
+          <w:tcPr>
+            <w:tcW w:w="266" w:type="pct"/>
+            <w:vAlign w:val="center"/>
+          </w:tcPr>
+          <w:p>
+            <w:pPr>
+              <w:spacing w:before="40" w:after="40"/>
+              <w:jc w:val="center"/>
+              <w:rPr>
+                <w:rFonts w:ascii="Aptos Display" w:eastAsiaTheme="minorHAnsi" w:hAnsi="Aptos Display"/>
+                <w:sz w:val="20"/>
+                <w:szCs w:val="20"/>
+              </w:rPr>
+            </w:pPr>
+          </w:p>
+        </w:tc>
+        <w:tc>
+          <w:tcPr>
+            <w:tcW w:w="269" w:type="pct"/>
             <w:vAlign w:val="center"/>
           </w:tcPr>
           <w:p>
@@ -3038,8 +3789,9 @@
     <w:p/>
     <w:sectPr>
       <w:headerReference w:type="default" r:id="rId7"/>
+      <w:footerReference w:type="default" r:id="rId8"/>
       <w:pgSz w:w="11906" w:h="16838"/>
-      <w:pgMar w:top="1417" w:right="1417" w:bottom="1417" w:left="1417" w:header="708" w:footer="708" w:gutter="0"/>
+      <w:pgMar w:top="1417" w:right="1417" w:bottom="1417" w:left="1417" w:header="708" w:footer="183" w:gutter="0"/>
       <w:cols w:space="708"/>
       <w:docGrid w:linePitch="360"/>
     </w:sectPr>
@@ -3070,6 +3822,183 @@
     </w:p>
   </w:endnote>
 </w:endnotes>
+</file>
+
+<file path=word/footer1.xml><?xml version="1.0" encoding="utf-8"?>
+<w:ftr xmlns:wpc="http://schemas.microsoft.com/office/word/2010/wordprocessingCanvas" xmlns:cx="http://schemas.microsoft.com/office/drawing/2014/chartex" xmlns:cx1="http://schemas.microsoft.com/office/drawing/2015/9/8/chartex" xmlns:cx2="http://schemas.microsoft.com/office/drawing/2015/10/21/chartex" xmlns:cx3="http://schemas.microsoft.com/office/drawing/2016/5/9/chartex" xmlns:cx4="http://schemas.microsoft.com/office/drawing/2016/5/10/chartex" xmlns:cx5="http://schemas.microsoft.com/office/drawing/2016/5/11/chartex" xmlns:cx6="http://schemas.microsoft.com/office/drawing/2016/5/12/chartex" xmlns:cx7="http://schemas.microsoft.com/office/drawing/2016/5/13/chartex" xmlns:cx8="http://schemas.microsoft.com/office/drawing/2016/5/14/chartex" xmlns:mc="http://schemas.openxmlformats.org/markup-compatibility/2006" xmlns:aink="http://schemas.microsoft.com/office/drawing/2016/ink" xmlns:am3d="http://schemas.microsoft.com/office/drawing/2017/model3d" xmlns:o="urn:schemas-microsoft-com:office:office" xmlns:oel="http://schemas.microsoft.com/office/2019/extlst" xmlns:r="http://schemas.openxmlformats.org/officeDocument/2006/relationships" xmlns:m="http://schemas.openxmlformats.org/officeDocument/2006/math" xmlns:v="urn:schemas-microsoft-com:vml" xmlns:wp14="http://schemas.microsoft.com/office/word/2010/wordprocessingDrawing" xmlns:wp="http://schemas.openxmlformats.org/drawingml/2006/wordprocessingDrawing" xmlns:w10="urn:schemas-microsoft-com:office:word" xmlns:w="http://schemas.openxmlformats.org/wordprocessingml/2006/main" xmlns:w14="http://schemas.microsoft.com/office/word/2010/wordml" xmlns:w15="http://schemas.microsoft.com/office/word/2012/wordml" xmlns:w16cex="http://schemas.microsoft.com/office/word/2018/wordml/cex" xmlns:w16cid="http://schemas.microsoft.com/office/word/2016/wordml/cid" xmlns:w16="http://schemas.microsoft.com/office/word/2018/wordml" xmlns:w16du="http://schemas.microsoft.com/office/word/2023/wordml/word16du" xmlns:w16sdtdh="http://schemas.microsoft.com/office/word/2020/wordml/sdtdatahash" xmlns:w16sdtfl="http://schemas.microsoft.com/office/word/2024/wordml/sdtformatlock" xmlns:w16se="http://schemas.microsoft.com/office/word/2015/wordml/symex" xmlns:wpg="http://schemas.microsoft.com/office/word/2010/wordprocessingGroup" xmlns:wpi="http://schemas.microsoft.com/office/word/2010/wordprocessingInk" xmlns:wne="http://schemas.microsoft.com/office/word/2006/wordml" xmlns:wps="http://schemas.microsoft.com/office/word/2010/wordprocessingShape" mc:Ignorable="w14 w15 w16se w16cid w16 w16cex w16sdtdh w16sdtfl w16du wp14">
+  <w:p>
+    <w:pPr>
+      <w:spacing w:after="0"/>
+      <w:ind w:right="-284"/>
+      <w:rPr>
+        <w:rFonts w:ascii="Bauhaus 93" w:hAnsi="Bauhaus 93" w:cs="Segoe UI"/>
+        <w:b/>
+        <w:bCs/>
+        <w:color w:val="006600"/>
+        <w:sz w:val="16"/>
+        <w:szCs w:val="16"/>
+      </w:rPr>
+    </w:pPr>
+  </w:p>
+  <w:p>
+    <w:pPr>
+      <w:spacing w:after="0"/>
+      <w:ind w:left="-284" w:right="-284"/>
+      <w:jc w:val="center"/>
+      <w:rPr>
+        <w:rFonts w:ascii="Bauhaus 93" w:hAnsi="Bauhaus 93" w:cs="Segoe UI"/>
+        <w:b/>
+        <w:bCs/>
+        <w:color w:val="005C2B"/>
+        <w:sz w:val="16"/>
+        <w:szCs w:val="16"/>
+      </w:rPr>
+    </w:pPr>
+    <w:r>
+      <w:rPr>
+        <w:rFonts w:ascii="Bauhaus 93" w:hAnsi="Bauhaus 93" w:cs="Segoe UI"/>
+        <w:color w:val="005C2B"/>
+        <w:sz w:val="16"/>
+        <w:szCs w:val="16"/>
+      </w:rPr>
+      <w:t>GREEN INNOVATIVE’S SARL</w:t>
+    </w:r>
+  </w:p>
+  <w:p>
+    <w:pPr>
+      <w:spacing w:after="0"/>
+      <w:ind w:left="-284" w:right="-284"/>
+      <w:jc w:val="center"/>
+      <w:rPr>
+        <w:rFonts w:cs="Segoe UI"/>
+        <w:sz w:val="16"/>
+        <w:szCs w:val="16"/>
+      </w:rPr>
+    </w:pPr>
+    <w:r>
+      <w:rPr>
+        <w:rFonts w:cs="Segoe UI"/>
+        <w:sz w:val="16"/>
+        <w:szCs w:val="16"/>
+      </w:rPr>
+      <w:t xml:space="preserve">BP 1982 Douala Tél:(237)6 </w:t>
+    </w:r>
+    <w:r>
+      <w:rPr>
+        <w:rFonts w:cs="Segoe UI"/>
+        <w:sz w:val="16"/>
+        <w:szCs w:val="16"/>
+      </w:rPr>
+      <w:t xml:space="preserve">94 21 91 80 </w:t>
+    </w:r>
+    <w:r>
+      <w:rPr>
+        <w:rFonts w:cs="Segoe UI"/>
+        <w:sz w:val="16"/>
+        <w:szCs w:val="16"/>
+      </w:rPr>
+      <w:t xml:space="preserve">/6 75 49 51 28 N°C : </w:t>
+    </w:r>
+    <w:r>
+      <w:rPr>
+        <w:rFonts w:cs="Segoe UI"/>
+        <w:sz w:val="16"/>
+        <w:szCs w:val="16"/>
+      </w:rPr>
+      <w:t>M022118500032F RCCM/DLA/02-2024/M/01093</w:t>
+    </w:r>
+  </w:p>
+  <w:p>
+    <w:pPr>
+      <w:spacing w:after="0"/>
+      <w:ind w:left="-284" w:right="-284"/>
+      <w:jc w:val="center"/>
+      <w:rPr>
+        <w:rFonts w:cs="Segoe UI"/>
+        <w:sz w:val="16"/>
+        <w:szCs w:val="16"/>
+      </w:rPr>
+    </w:pPr>
+    <w:r>
+      <w:rPr>
+        <w:rFonts w:cs="Segoe UI"/>
+        <w:i/>
+        <w:sz w:val="16"/>
+        <w:szCs w:val="16"/>
+      </w:rPr>
+      <w:t>E-mail </w:t>
+    </w:r>
+    <w:hyperlink r:id="rId1" w:history="1">
+      <w:r>
+        <w:rPr>
+          <w:rStyle w:val="Lienhypertexte"/>
+          <w:rFonts w:cs="Segoe UI"/>
+          <w:i/>
+          <w:sz w:val="16"/>
+          <w:szCs w:val="16"/>
+        </w:rPr>
+        <w:t>greeninnovatives46@gmail.com</w:t>
+      </w:r>
+    </w:hyperlink>
+    <w:r>
+      <w:rPr>
+        <w:rFonts w:cs="Segoe UI"/>
+        <w:i/>
+        <w:sz w:val="16"/>
+        <w:szCs w:val="16"/>
+      </w:rPr>
+      <w:t xml:space="preserve"> </w:t>
+    </w:r>
+    <w:r>
+      <w:rPr>
+        <w:rFonts w:cs="Segoe UI"/>
+        <w:i/>
+        <w:sz w:val="16"/>
+        <w:szCs w:val="16"/>
+      </w:rPr>
+      <w:t xml:space="preserve"> 2</w:t>
+    </w:r>
+    <w:r>
+      <w:rPr>
+        <w:rFonts w:cs="Segoe UI"/>
+        <w:i/>
+        <w:sz w:val="16"/>
+        <w:szCs w:val="16"/>
+        <w:vertAlign w:val="superscript"/>
+      </w:rPr>
+      <w:t xml:space="preserve">e </w:t>
+    </w:r>
+    <w:r>
+      <w:rPr>
+        <w:rFonts w:cs="Segoe UI"/>
+        <w:i/>
+        <w:sz w:val="16"/>
+        <w:szCs w:val="16"/>
+      </w:rPr>
+      <w:t xml:space="preserve">entrée côté Station Total </w:t>
+    </w:r>
+    <w:proofErr w:type="spellStart"/>
+    <w:r>
+      <w:rPr>
+        <w:rFonts w:cs="Segoe UI"/>
+        <w:i/>
+        <w:sz w:val="16"/>
+        <w:szCs w:val="16"/>
+      </w:rPr>
+      <w:t>Ndog-bong</w:t>
+    </w:r>
+    <w:proofErr w:type="spellEnd"/>
+    <w:r>
+      <w:rPr>
+        <w:rFonts w:cs="Segoe UI"/>
+        <w:i/>
+        <w:sz w:val="16"/>
+        <w:szCs w:val="16"/>
+      </w:rPr>
+      <w:t xml:space="preserve"> avant Lycée Technique</w:t>
+    </w:r>
+  </w:p>
+</w:ftr>
 </file>
 
 <file path=word/footnotes.xml><?xml version="1.0" encoding="utf-8"?>
@@ -3122,7 +4051,7 @@
           <wp:extent cx="1361567" cy="1361567"/>
           <wp:effectExtent l="0" t="0" r="0" b="0"/>
           <wp:wrapNone/>
-          <wp:docPr id="7" name="Graphique 7"/>
+          <wp:docPr id="1147342886" name="Graphique 7"/>
           <wp:cNvGraphicFramePr>
             <a:graphicFrameLocks xmlns:a="http://schemas.openxmlformats.org/drawingml/2006/main" noChangeAspect="1"/>
           </wp:cNvGraphicFramePr>
@@ -3183,7 +4112,7 @@
           <wp:extent cx="453600" cy="471600"/>
           <wp:effectExtent l="105410" t="104140" r="109220" b="109220"/>
           <wp:wrapNone/>
-          <wp:docPr id="8" name="Image 8"/>
+          <wp:docPr id="1165874005" name="Image 1165874005"/>
           <wp:cNvGraphicFramePr>
             <a:graphicFrameLocks xmlns:a="http://schemas.openxmlformats.org/drawingml/2006/main" noChangeAspect="1"/>
           </wp:cNvGraphicFramePr>
@@ -3569,7 +4498,7 @@
           <wp:extent cx="2997642" cy="1498821"/>
           <wp:effectExtent l="0" t="0" r="0" b="0"/>
           <wp:wrapNone/>
-          <wp:docPr id="6" name="Image 6"/>
+          <wp:docPr id="470647079" name="Image 470647079"/>
           <wp:cNvGraphicFramePr>
             <a:graphicFrameLocks xmlns:a="http://schemas.openxmlformats.org/drawingml/2006/main" noChangeAspect="1"/>
           </wp:cNvGraphicFramePr>
@@ -5364,6 +6293,17 @@
       </w:tblBorders>
     </w:tblPr>
   </w:style>
+  <w:style w:type="character" w:styleId="Lienhypertexte">
+    <w:name w:val="Hyperlink"/>
+    <w:basedOn w:val="Policepardfaut"/>
+    <w:uiPriority w:val="99"/>
+    <w:unhideWhenUsed/>
+    <w:rsid w:val="00C576C4"/>
+    <w:rPr>
+      <w:color w:val="0563C1" w:themeColor="hyperlink"/>
+      <w:u w:val="single"/>
+    </w:rPr>
+  </w:style>
 </w:styles>
 </file>
 

</xml_diff>